<commit_message>
Updated the report draft
</commit_message>
<xml_diff>
--- a/WSA_Project_Report_DRAFT.docx
+++ b/WSA_Project_Report_DRAFT.docx
@@ -92,7 +92,7 @@
     <w:p>
       <w:pPr>
         <w:pStyle w:val="Heading1"/>
-        <w:spacing w:after="200" w:before="400"/>
+        <w:spacing w:after="120" w:before="260"/>
       </w:pPr>
       <w:r>
         <w:t xml:space="preserve">1. Objective</w:t>
@@ -100,18 +100,18 @@
     </w:p>
     <w:p>
       <w:pPr>
-        <w:spacing w:after="150"/>
-      </w:pPr>
-      <w:r>
-        <w:t xml:space="preserve">Machine translation (MT) tools such as DeepL and Google Translate, along with LLM-based translation, have become part of everyday language work — used by casual social media users, professional translators, and developers alike. This project studies how Bluesky, a decentralized social network, talks about machine translation: whether it is framed as a helpful tool, a threat to professional translators, or both, and whether this framing differs between people who work in translation/localization and the general public.</w:t>
-      </w:r>
-    </w:p>
-    <w:p>
-      <w:pPr>
-        <w:spacing w:after="150"/>
-      </w:pPr>
-      <w:r>
-        <w:t xml:space="preserve">Posts were collected around a fixed set of MT-related keywords and hashtags over a 12-month window, and analyzed along two complementary axes:</w:t>
+        <w:spacing w:after="100"/>
+      </w:pPr>
+      <w:r>
+        <w:t xml:space="preserve">Machine translation (MT) tools such as DeepL and Google Translate, along with LLM-based translation, are now used by casual social media users, professional translators, and developers alike. This project studies how Bluesky talks about MT — as a helpful tool, a threat to professional translators, or both — and whether that framing differs between people who work in translation/localization and the general public. Posts were collected around a fixed set of MT-related keywords and hashtags over a 12-month window, and analyzed along two complementary axes: Network Analysis (who talks to whom) and Content Analysis (what is actually being said).</w:t>
+      </w:r>
+    </w:p>
+    <w:p>
+      <w:pPr>
+        <w:spacing w:after="100"/>
+      </w:pPr>
+      <w:r>
+        <w:t xml:space="preserve">Guiding research questions:</w:t>
       </w:r>
     </w:p>
     <w:p>
@@ -121,10 +121,10 @@
           <w:ilvl w:val="0"/>
           <w:numId w:val="1"/>
         </w:numPr>
-        <w:spacing w:after="60"/>
-      </w:pPr>
-      <w:r>
-        <w:t xml:space="preserve">Network Analysis — who talks to whom (centrality, community detection).</w:t>
+        <w:spacing w:after="40"/>
+      </w:pPr>
+      <w:r>
+        <w:t xml:space="preserve">RQ1 — Sentiment &amp; framing: do people talk about MT as a tool, a threat, or both?</w:t>
       </w:r>
     </w:p>
     <w:p>
@@ -134,18 +134,10 @@
           <w:ilvl w:val="0"/>
           <w:numId w:val="1"/>
         </w:numPr>
-        <w:spacing w:after="60"/>
-      </w:pPr>
-      <w:r>
-        <w:t xml:space="preserve">Content Analysis — what is actually being said (sentiment, emotion, named entities).</w:t>
-      </w:r>
-    </w:p>
-    <w:p>
-      <w:pPr>
-        <w:spacing w:after="150"/>
-      </w:pPr>
-      <w:r>
-        <w:t xml:space="preserve">The three guiding research questions, used throughout both analyses, are:</w:t>
+        <w:spacing w:after="40"/>
+      </w:pPr>
+      <w:r>
+        <w:t xml:space="preserve">RQ2 — Professional impact discourse: how do working translators discuss MT's effect on their careers, compared to the general public?</w:t>
       </w:r>
     </w:p>
     <w:p>
@@ -155,10 +147,10 @@
           <w:ilvl w:val="0"/>
           <w:numId w:val="1"/>
         </w:numPr>
-        <w:spacing w:after="60"/>
-      </w:pPr>
-      <w:r>
-        <w:t xml:space="preserve">RQ1 — Sentiment &amp; framing: do people talk about MT as a tool, a threat, or both?</w:t>
+        <w:spacing w:after="40"/>
+      </w:pPr>
+      <w:r>
+        <w:t xml:space="preserve">RQ3 — Utility vs. displacement tension: do people acknowledge MT's utility while lamenting professional erosion?</w:t>
       </w:r>
     </w:p>
     <w:p>
@@ -168,10 +160,36 @@
           <w:ilvl w:val="0"/>
           <w:numId w:val="1"/>
         </w:numPr>
-        <w:spacing w:after="60"/>
-      </w:pPr>
-      <w:r>
-        <w:t xml:space="preserve">RQ2 — Professional impact discourse: how do working translators discuss MT's effect on their careers, compared to the general public?</w:t>
+        <w:spacing w:after="40"/>
+      </w:pPr>
+      <w:r>
+        <w:t xml:space="preserve">RQ4 — Network structure: do professional translators and general users form distinct communities in the follow/reply networks, and which accounts bridge them?</w:t>
+      </w:r>
+    </w:p>
+    <w:p>
+      <w:pPr>
+        <w:pStyle w:val="Heading1"/>
+        <w:spacing w:after="120" w:before="260"/>
+      </w:pPr>
+      <w:r>
+        <w:t xml:space="preserve">2. Data</w:t>
+      </w:r>
+    </w:p>
+    <w:p>
+      <w:pPr>
+        <w:pStyle w:val="Heading2"/>
+        <w:spacing w:after="100" w:before="200"/>
+      </w:pPr>
+      <w:r>
+        <w:t xml:space="preserve">2.1 Collection strategy</w:t>
+      </w:r>
+    </w:p>
+    <w:p>
+      <w:pPr>
+        <w:spacing w:after="100"/>
+      </w:pPr>
+      <w:r>
+        <w:t xml:space="preserve">Data was collected from Bluesky via the official API (Python atproto client):</w:t>
       </w:r>
     </w:p>
     <w:p>
@@ -181,10 +199,10 @@
           <w:ilvl w:val="0"/>
           <w:numId w:val="1"/>
         </w:numPr>
-        <w:spacing w:after="60"/>
-      </w:pPr>
-      <w:r>
-        <w:t xml:space="preserve">RQ3 — Utility vs. displacement tension: do people acknowledge MT's utility while lamenting professional erosion?</w:t>
+        <w:spacing w:after="40"/>
+      </w:pPr>
+      <w:r>
+        <w:t xml:space="preserve">Seed search: a fixed list of text queries, compound queries, and hashtags (below) searched over the last 12 months, sorted by recency.</w:t>
       </w:r>
     </w:p>
     <w:p>
@@ -194,36 +212,10 @@
           <w:ilvl w:val="0"/>
           <w:numId w:val="1"/>
         </w:numPr>
-        <w:spacing w:after="60"/>
-      </w:pPr>
-      <w:r>
-        <w:t xml:space="preserve">RQ4 — Network structure: do professional translators and general users form distinct communities in the follow/reply networks, and which accounts bridge them?</w:t>
-      </w:r>
-    </w:p>
-    <w:p>
-      <w:pPr>
-        <w:pStyle w:val="Heading1"/>
-        <w:spacing w:after="200" w:before="400"/>
-      </w:pPr>
-      <w:r>
-        <w:t xml:space="preserve">2. Data</w:t>
-      </w:r>
-    </w:p>
-    <w:p>
-      <w:pPr>
-        <w:pStyle w:val="Heading2"/>
-        <w:spacing w:after="150" w:before="300"/>
-      </w:pPr>
-      <w:r>
-        <w:t xml:space="preserve">2.1 Collection strategy</w:t>
-      </w:r>
-    </w:p>
-    <w:p>
-      <w:pPr>
-        <w:spacing w:after="150"/>
-      </w:pPr>
-      <w:r>
-        <w:t xml:space="preserve">Data was collected from Bluesky via the official API (Python atproto client), following a four-step pipeline:</w:t>
+        <w:spacing w:after="40"/>
+      </w:pPr>
+      <w:r>
+        <w:t xml:space="preserve">Thread crawl: each seed post's full reply thread is crawled and walked in memory. Reply edges aren't collected at crawl time — every post already stores its parent URI, so edges are derived from the posts table during preprocessing instead, which also captures seed posts that are themselves replies.</w:t>
       </w:r>
     </w:p>
     <w:p>
@@ -233,10 +225,10 @@
           <w:ilvl w:val="0"/>
           <w:numId w:val="1"/>
         </w:numPr>
-        <w:spacing w:after="60"/>
-      </w:pPr>
-      <w:r>
-        <w:t xml:space="preserve">Seed search: a fixed list of text queries, compound queries, and hashtags (below) was searched over the last 12 months, sorted by recency.</w:t>
+        <w:spacing w:after="40"/>
+      </w:pPr>
+      <w:r>
+        <w:t xml:space="preserve">Author/follower crawl: for authors with ≥ 2 posts, up to 100 followers were fetched to build the follow network; profiles were fetched for essentially all post authors (not just top ones), so bio-based labeling isn't biased toward frequent posters.</w:t>
       </w:r>
     </w:p>
     <w:p>
@@ -246,10 +238,18 @@
           <w:ilvl w:val="0"/>
           <w:numId w:val="1"/>
         </w:numPr>
-        <w:spacing w:after="60"/>
-      </w:pPr>
-      <w:r>
-        <w:t xml:space="preserve">Thread crawl: each seed post's full reply thread was crawled (one get_post_thread call per seed, depth 10, walked in memory). Reply edges are not collected at crawl time — every post already stores its parent URI in reply_to, so edges are derived from the posts table itself during preprocessing, which also captures seed posts that are themselves replies.</w:t>
+        <w:spacing w:after="40"/>
+      </w:pPr>
+      <w:r>
+        <w:t xml:space="preserve">Deduplication across all sources into the final dataset.</w:t>
+      </w:r>
+    </w:p>
+    <w:p>
+      <w:pPr>
+        <w:spacing w:after="100"/>
+      </w:pPr>
+      <w:r>
+        <w:t xml:space="preserve">Seed queries:</w:t>
       </w:r>
     </w:p>
     <w:p>
@@ -259,10 +259,10 @@
           <w:ilvl w:val="0"/>
           <w:numId w:val="1"/>
         </w:numPr>
-        <w:spacing w:after="60"/>
-      </w:pPr>
-      <w:r>
-        <w:t xml:space="preserve">Author/follower crawl: for authors with at least 2 collected posts, up to 100 of their followers were fetched to build the follow network; profiles (for bio-based user-type labeling) were fetched for essentially all post authors, not just the top ones, so labeling coverage isn't biased toward frequent posters.</w:t>
+        <w:spacing w:after="40"/>
+      </w:pPr>
+      <w:r>
+        <w:t xml:space="preserve">Text: "machine translation", "AI translation", "post-editing", "human translation", "translation quality", "translator jobs", "translation industry", "DeepL", "MTPE", "neural machine translation"</w:t>
       </w:r>
     </w:p>
     <w:p>
@@ -272,18 +272,10 @@
           <w:ilvl w:val="0"/>
           <w:numId w:val="1"/>
         </w:numPr>
-        <w:spacing w:after="60"/>
-      </w:pPr>
-      <w:r>
-        <w:t xml:space="preserve">Deduplication: posts and edges were deduplicated across all sources into the final dataset.</w:t>
-      </w:r>
-    </w:p>
-    <w:p>
-      <w:pPr>
-        <w:spacing w:after="150"/>
-      </w:pPr>
-      <w:r>
-        <w:t xml:space="preserve">Seed queries used:</w:t>
+        <w:spacing w:after="40"/>
+      </w:pPr>
+      <w:r>
+        <w:t xml:space="preserve">Compound: "post-editing" AI, "AI translation" threat, scraped translation, "machine translation" slop, "human translator" AI, "translation industry" AI</w:t>
       </w:r>
     </w:p>
     <w:p>
@@ -293,33 +285,7 @@
           <w:ilvl w:val="0"/>
           <w:numId w:val="1"/>
         </w:numPr>
-        <w:spacing w:after="60"/>
-      </w:pPr>
-      <w:r>
-        <w:t xml:space="preserve">Text queries: "machine translation", "AI translation", "post-editing", "human translation", "translation quality", "translator jobs", "translation industry", "DeepL", "MTPE", "neural machine translation"</w:t>
-      </w:r>
-    </w:p>
-    <w:p>
-      <w:pPr>
-        <w:pStyle w:val="ListParagraph"/>
-        <w:numPr>
-          <w:ilvl w:val="0"/>
-          <w:numId w:val="1"/>
-        </w:numPr>
-        <w:spacing w:after="60"/>
-      </w:pPr>
-      <w:r>
-        <w:t xml:space="preserve">Compound queries: "post-editing" AI, "AI translation" threat, scraped translation, "machine translation" slop, "human translator" AI, "translation industry" AI</w:t>
-      </w:r>
-    </w:p>
-    <w:p>
-      <w:pPr>
-        <w:pStyle w:val="ListParagraph"/>
-        <w:numPr>
-          <w:ilvl w:val="0"/>
-          <w:numId w:val="1"/>
-        </w:numPr>
-        <w:spacing w:after="60"/>
+        <w:spacing w:after="40"/>
       </w:pPr>
       <w:r>
         <w:t xml:space="preserve">Hashtags: #machinetranslation, #MTPE, #localization, #l10n, #SlowTranslation, #HumanTranslation, #PauseAI, #NoAI</w:t>
@@ -327,16 +293,16 @@
     </w:p>
     <w:p>
       <w:pPr>
-        <w:spacing w:after="150"/>
-      </w:pPr>
-      <w:r>
-        <w:t xml:space="preserve">The API client includes retry/backoff handling for rate limits (HTTP 429), and extracts hashtags, mentions, and links from each post's rich-text facets. Preprocessing is idempotent — every output (including graph.csv) is rebuilt fresh from the raw inputs each run, so re-running any step cannot corrupt the data.</w:t>
+        <w:spacing w:after="100"/>
+      </w:pPr>
+      <w:r>
+        <w:t xml:space="preserve">Preprocessing is idempotent — every output, including graph.csv, is rebuilt fresh from the raw inputs each run, so re-running a step cannot corrupt the data.</w:t>
       </w:r>
     </w:p>
     <w:p>
       <w:pPr>
         <w:pStyle w:val="Heading2"/>
-        <w:spacing w:after="150" w:before="300"/>
+        <w:spacing w:after="100" w:before="200"/>
       </w:pPr>
       <w:r>
         <w:t xml:space="preserve">2.2 Preprocessing and labeling</w:t>
@@ -344,46 +310,32 @@
     </w:p>
     <w:p>
       <w:pPr>
-        <w:spacing w:after="150"/>
-      </w:pPr>
-      <w:r>
-        <w:t xml:space="preserve">Cleaning: post text has URLs stripped and whitespace normalized; posts with fewer than 10 characters of cleaned text are dropped; placeholder accounts (Bluesky's handle.invalid for deleted/unresolvable users) are removed.</w:t>
-      </w:r>
-    </w:p>
-    <w:p>
-      <w:pPr>
-        <w:spacing w:after="150"/>
-      </w:pPr>
-      <w:r>
-        <w:t xml:space="preserve">Topical relevance filtering: because several seed queries (e.g. #localization, #PauseAI, #NoAI) can return off-topic posts, a keyword filter is applied requiring at least one of a fixed set of MT-related terms (translat*, interpret*, locali*e*, deepl, mtpe, post-edit, language model, nlp, multilingual, linguist, terminology, glossary) to appear in the cleaned text. A second, targeted filter removes a specific keyword collision: "MTPE" also abbreviates Peru's Ministry of Labor (Ministerio de Trabajo y Promoción del Empleo), so posts matching MTPE together with Spanish employment/ministry terms are dropped as noise rather than machine-translation discourse.</w:t>
-      </w:r>
-    </w:p>
-    <w:p>
-      <w:pPr>
-        <w:spacing w:after="150"/>
-      </w:pPr>
-      <w:r>
-        <w:t xml:space="preserve">Author type labeling: each author is labeled general / professional / tech from their Bluesky bio, using a keyword match — professional if the bio contains translator/interpreter/localizer/linguist/terminology/lexicographer/subtitler/transcriber-related terms, tech if it contains developer/engineer/NLP/ML/researcher-related terms (checked only if no professional terms matched), general if a bio was fetched but matches neither. Authors whose profile was fetched but had no bio text at all are labeled unknown rather than general, so that "no information" isn't silently conflated with "an ordinary user" (see Results, Section 4.2 for how this shows up).</w:t>
-      </w:r>
-    </w:p>
-    <w:p>
-      <w:pPr>
-        <w:shd w:fill="FFF2F2" w:val="clear"/>
-        <w:spacing w:after="300" w:before="100"/>
-      </w:pPr>
-      <w:r>
-        <w:rPr>
-          <w:i/>
-          <w:iCs/>
-          <w:color w:val="B00000"/>
-        </w:rPr>
-        <w:t xml:space="preserve">Limitation to note in the report: author-type labeling is a keyword-over-bio heuristic, not a validated classifier — a professional translator whose bio doesn't mention their profession would be labeled "general" or "unknown" rather than "professional". No manual validation of label accuracy was performed.</w:t>
+        <w:spacing w:after="100"/>
+      </w:pPr>
+      <w:r>
+        <w:t xml:space="preserve">Cleaning: URLs stripped, whitespace normalized, posts under 10 characters and placeholder (handle.invalid) accounts dropped.</w:t>
+      </w:r>
+    </w:p>
+    <w:p>
+      <w:pPr>
+        <w:spacing w:after="100"/>
+      </w:pPr>
+      <w:r>
+        <w:t xml:space="preserve">Topical relevance: a keyword filter (translat*, interpret*, locali*e*, deepl, mtpe, post-edit, language model, nlp, multilingual, linguist, terminology, glossary) removes off-topic posts pulled in by broad seed queries (e.g. #localization, #PauseAI). A second filter removes a specific collision: "MTPE" also abbreviates Peru's Ministry of Labor, so MTPE + Spanish employment/ministry terms together are dropped as noise.</w:t>
+      </w:r>
+    </w:p>
+    <w:p>
+      <w:pPr>
+        <w:spacing w:after="100"/>
+      </w:pPr>
+      <w:r>
+        <w:t xml:space="preserve">Author-type labeling: general / professional / tech, by keyword match on bio (professional: translator/interpreter/localizer/linguist/terminology/lexicographer/subtitler/transcriber terms; tech: developer/engineer/NLP/ML/researcher terms, checked only if no professional terms matched). Authors with a fetched profile but no bio text are labeled unknown rather than general, so "no information" isn't silently treated as "ordinary user" (see Section 4.2).</w:t>
       </w:r>
     </w:p>
     <w:p>
       <w:pPr>
         <w:pStyle w:val="Heading2"/>
-        <w:spacing w:after="150" w:before="300"/>
+        <w:spacing w:after="100" w:before="200"/>
       </w:pPr>
       <w:r>
         <w:t xml:space="preserve">2.3 Final dataset</w:t>
@@ -391,7 +343,7 @@
     </w:p>
     <w:p>
       <w:pPr>
-        <w:spacing w:after="150"/>
+        <w:spacing w:after="100"/>
       </w:pPr>
       <w:r>
         <w:t xml:space="preserve">After collection, cleaning, and topical filtering, the dataset used for analysis is:</w:t>
@@ -796,12 +748,12 @@
     </w:tbl>
     <w:p>
       <w:pPr>
-        <w:spacing w:after="200"/>
-      </w:pPr>
-    </w:p>
-    <w:p>
-      <w:pPr>
-        <w:spacing w:after="150"/>
+        <w:spacing w:after="100"/>
+      </w:pPr>
+    </w:p>
+    <w:p>
+      <w:pPr>
+        <w:spacing w:after="100"/>
       </w:pPr>
       <w:r>
         <w:t xml:space="preserve">Author-type breakdown of the 3,864 posts:</w:t>
@@ -1065,21 +1017,21 @@
     </w:tbl>
     <w:p>
       <w:pPr>
-        <w:spacing w:after="200"/>
-      </w:pPr>
-    </w:p>
-    <w:p>
-      <w:pPr>
-        <w:spacing w:after="150"/>
-      </w:pPr>
-      <w:r>
-        <w:t xml:space="preserve">2,261 posts (58.5%) are replies and 1,603 (41.5%) are top-level posts. Note the strong class imbalance between user types — all cross-group comparisons in this report use rates/proportions rather than raw counts for this reason. All 218 unknown-labeled posts come from authors whose profile was successfully fetched but had an empty/null bio — not from missing profiles (profile coverage was 100% of post authors in this run).</w:t>
+        <w:spacing w:after="100"/>
+      </w:pPr>
+    </w:p>
+    <w:p>
+      <w:pPr>
+        <w:spacing w:after="100"/>
+      </w:pPr>
+      <w:r>
+        <w:t xml:space="preserve">2,261 posts (58.5%) are replies. Note the strong class imbalance between user types — all cross-group comparisons in this report use rates/proportions rather than raw counts for this reason. All 218 unknown-labeled posts come from a fetched profile with an empty bio, not a missing profile (profile coverage was 100% of post authors).</w:t>
       </w:r>
     </w:p>
     <w:p>
       <w:pPr>
         <w:pStyle w:val="Heading1"/>
-        <w:spacing w:after="200" w:before="400"/>
+        <w:spacing w:after="120" w:before="260"/>
       </w:pPr>
       <w:r>
         <w:t xml:space="preserve">3. Models</w:t>
@@ -1088,7 +1040,7 @@
     <w:p>
       <w:pPr>
         <w:pStyle w:val="Heading2"/>
-        <w:spacing w:after="150" w:before="300"/>
+        <w:spacing w:after="100" w:before="200"/>
       </w:pPr>
       <w:r>
         <w:t xml:space="preserve">3.1 Network Analysis Models</w:t>
@@ -1096,22 +1048,21 @@
     </w:p>
     <w:p>
       <w:pPr>
-        <w:shd w:fill="FFF2F2" w:val="clear"/>
-        <w:spacing w:after="300" w:before="100"/>
+        <w:spacing w:after="200" w:before="80"/>
       </w:pPr>
       <w:r>
         <w:rPr>
           <w:i/>
           <w:iCs/>
-          <w:color w:val="B00000"/>
+          <w:color w:val="666666"/>
         </w:rPr>
-        <w:t xml:space="preserve">[TO BE COMPLETED — network analysis (degree/betweenness/closeness centrality; Louvain, Greedy Modularity, FluidC and Girvan-Newman community detection) was carried out by [groupmate] in analysis.ipynb. Not included in this draft since it is not this author's work — see analysis.ipynb directly for the implementation.]</w:t>
+        <w:t xml:space="preserve">To be completed by Pelinsu Topaloglu — degree/betweenness/closeness centrality and community detection (Louvain, Greedy Modularity, FluidC, Girvan-Newman), in 02_network_analysis.ipynb.</w:t>
       </w:r>
     </w:p>
     <w:p>
       <w:pPr>
         <w:pStyle w:val="Heading2"/>
-        <w:spacing w:after="150" w:before="300"/>
+        <w:spacing w:after="100" w:before="200"/>
       </w:pPr>
       <w:r>
         <w:t xml:space="preserve">3.2 Content Analysis Models</w:t>
@@ -1119,16 +1070,16 @@
     </w:p>
     <w:p>
       <w:pPr>
-        <w:spacing w:after="150"/>
-      </w:pPr>
-      <w:r>
-        <w:t xml:space="preserve">For both sentiment and emotion, two methodologically different tools were deliberately used and cross-checked against each other, rather than trusting a single method — this surfaced real, reportable limitations in the lexicon-based tools (see Results).</w:t>
+        <w:spacing w:after="100"/>
+      </w:pPr>
+      <w:r>
+        <w:t xml:space="preserve">Sentiment and emotion each use two methodologically different tools, cross-checked against each other rather than trusting a single method — this surfaced real limitations in the lexicon-based tools (see Results).</w:t>
       </w:r>
     </w:p>
     <w:p>
       <w:pPr>
         <w:pStyle w:val="Heading3"/>
-        <w:spacing w:after="100" w:before="200"/>
+        <w:spacing w:after="80" w:before="140"/>
       </w:pPr>
       <w:r>
         <w:t xml:space="preserve">Sentiment analysis</w:t>
@@ -1141,10 +1092,10 @@
           <w:ilvl w:val="0"/>
           <w:numId w:val="1"/>
         </w:numPr>
-        <w:spacing w:after="60"/>
-      </w:pPr>
-      <w:r>
-        <w:t xml:space="preserve">VADER (Valence Aware Dictionary and sEntiment Reasoner) — lexicon- and rule-based, tuned for social media text (negation, punctuation emphasis, intensifiers). Produces a compound score in [-1, 1], bucketed into positive (≥0.05) / neutral / negative (≤-0.05).</w:t>
+        <w:spacing w:after="40"/>
+      </w:pPr>
+      <w:r>
+        <w:t xml:space="preserve">VADER — lexicon- and rule-based, tuned for social media text. Compound score in [-1, 1], bucketed into positive (≥0.05) / neutral / negative (≤-0.05).</w:t>
       </w:r>
     </w:p>
     <w:p>
@@ -1154,16 +1105,16 @@
           <w:ilvl w:val="0"/>
           <w:numId w:val="1"/>
         </w:numPr>
-        <w:spacing w:after="60"/>
-      </w:pPr>
-      <w:r>
-        <w:t xml:space="preserve">cardiffnlp/twitter-roberta-base-sentiment — a RoBERTa transformer fine-tuned on tweet sentiment (3-way: negative/neutral/positive), which reads full sentences instead of scoring words independently.</w:t>
+        <w:spacing w:after="40"/>
+      </w:pPr>
+      <w:r>
+        <w:t xml:space="preserve">cardiffnlp/twitter-roberta-base-sentiment — a RoBERTa transformer fine-tuned on tweet sentiment (negative/neutral/positive), reading full sentences rather than scoring words independently.</w:t>
       </w:r>
     </w:p>
     <w:p>
       <w:pPr>
         <w:pStyle w:val="Heading3"/>
-        <w:spacing w:after="100" w:before="200"/>
+        <w:spacing w:after="80" w:before="140"/>
       </w:pPr>
       <w:r>
         <w:t xml:space="preserve">Emotion analysis</w:t>
@@ -1176,10 +1127,10 @@
           <w:ilvl w:val="0"/>
           <w:numId w:val="1"/>
         </w:numPr>
-        <w:spacing w:after="60"/>
-      </w:pPr>
-      <w:r>
-        <w:t xml:space="preserve">NRCLex — dictionary-based, using the NRC Word-Emotion Association Lexicon (Plutchik's 8 basic emotions: fear, anger, anticipation, trust, surprise, sadness, disgust, joy). Each post's dominant emotion is the argmax of its per-word affect frequencies.</w:t>
+        <w:spacing w:after="40"/>
+      </w:pPr>
+      <w:r>
+        <w:t xml:space="preserve">NRCLex — dictionary-based (NRC Word-Emotion Association Lexicon, Plutchik's 8 basic emotions). Dominant emotion = argmax of per-word affect frequencies.</w:t>
       </w:r>
     </w:p>
     <w:p>
@@ -1189,24 +1140,24 @@
           <w:ilvl w:val="0"/>
           <w:numId w:val="1"/>
         </w:numPr>
-        <w:spacing w:after="60"/>
-      </w:pPr>
-      <w:r>
-        <w:t xml:space="preserve">j-hartmann/emotion-english-distilroberta-base — a DistilRoBERTa transformer fine-tuned for emotion classification (anger, disgust, fear, joy, neutral, sadness, surprise), sharing 6 of its 7 labels with NRCLex.</w:t>
-      </w:r>
-    </w:p>
-    <w:p>
-      <w:pPr>
-        <w:spacing w:after="150"/>
-      </w:pPr>
-      <w:r>
-        <w:t xml:space="preserve">Methodological note: comparing the two emotion tools by restricting both to only the shared 6 labels (i.e. filtering out posts where NRCLex's dominant emotion is trust or anticipation) would introduce selection bias, since trust/anticipation are NRCLex's single most common calls. The comparison in this report instead conditions only on the transformer's output, then checks what NRCLex independently says about those same posts — this avoids manufacturing artificial agreement.</w:t>
+        <w:spacing w:after="40"/>
+      </w:pPr>
+      <w:r>
+        <w:t xml:space="preserve">j-hartmann/emotion-english-distilroberta-base — a DistilRoBERTa transformer (anger, disgust, fear, joy, neutral, sadness, surprise), sharing 6 of NRCLex's 8 labels.</w:t>
+      </w:r>
+    </w:p>
+    <w:p>
+      <w:pPr>
+        <w:spacing w:after="100"/>
+      </w:pPr>
+      <w:r>
+        <w:t xml:space="preserve">Comparing the two by restricting both to the shared 6 labels would introduce selection bias, since trust/anticipation are NRCLex's most common calls. Instead, the comparison conditions only on the transformer's output, then checks what NRCLex independently says about those same posts.</w:t>
       </w:r>
     </w:p>
     <w:p>
       <w:pPr>
         <w:pStyle w:val="Heading3"/>
-        <w:spacing w:after="100" w:before="200"/>
+        <w:spacing w:after="80" w:before="140"/>
       </w:pPr>
       <w:r>
         <w:t xml:space="preserve">Named entity recognition</w:t>
@@ -1219,10 +1170,10 @@
           <w:ilvl w:val="0"/>
           <w:numId w:val="1"/>
         </w:numPr>
-        <w:spacing w:after="60"/>
-      </w:pPr>
-      <w:r>
-        <w:t xml:space="preserve">spaCy (en_core_web_sm) — pretrained English NER pipeline, used to extract ORG, PRODUCT, PERSON, and GPE entities from post text.</w:t>
+        <w:spacing w:after="40"/>
+      </w:pPr>
+      <w:r>
+        <w:t xml:space="preserve">spaCy (en_core_web_sm) extracts ORG, PRODUCT, PERSON, and GPE entities from post text.</w:t>
       </w:r>
     </w:p>
     <w:p>
@@ -1232,16 +1183,16 @@
           <w:ilvl w:val="0"/>
           <w:numId w:val="1"/>
         </w:numPr>
-        <w:spacing w:after="60"/>
-      </w:pPr>
-      <w:r>
-        <w:t xml:space="preserve">A curated list of known MT tools/companies (DeepL, Google Translate, Google, Amazon, Microsoft, YouTube, Mozilla Localization, ChatGPT, OpenAI, GPT, Meta, Claude) was additionally cross-referenced against the raw NER output, since the generic model mis-tags several domain acronyms (see Results, Limitations).</w:t>
+        <w:spacing w:after="40"/>
+      </w:pPr>
+      <w:r>
+        <w:t xml:space="preserve">A curated list of known MT tools/companies (DeepL, Google Translate, Google, Amazon, Microsoft, YouTube, Mozilla Localization, ChatGPT, OpenAI, GPT, Meta, Claude) is cross-referenced against the raw NER output, since the generic model mis-tags several domain acronyms (see Limitations).</w:t>
       </w:r>
     </w:p>
     <w:p>
       <w:pPr>
         <w:pStyle w:val="Heading1"/>
-        <w:spacing w:after="200" w:before="400"/>
+        <w:spacing w:after="120" w:before="260"/>
       </w:pPr>
       <w:r>
         <w:t xml:space="preserve">4. Results</w:t>
@@ -1250,7 +1201,7 @@
     <w:p>
       <w:pPr>
         <w:pStyle w:val="Heading2"/>
-        <w:spacing w:after="150" w:before="300"/>
+        <w:spacing w:after="100" w:before="200"/>
       </w:pPr>
       <w:r>
         <w:t xml:space="preserve">4.1 Network Analysis Results</w:t>
@@ -1258,22 +1209,21 @@
     </w:p>
     <w:p>
       <w:pPr>
-        <w:shd w:fill="FFF2F2" w:val="clear"/>
-        <w:spacing w:after="300" w:before="100"/>
+        <w:spacing w:after="200" w:before="80"/>
       </w:pPr>
       <w:r>
         <w:rPr>
           <w:i/>
           <w:iCs/>
-          <w:color w:val="B00000"/>
+          <w:color w:val="666666"/>
         </w:rPr>
-        <w:t xml:space="preserve">[TO BE COMPLETED — centrality rankings, community detection comparison, and network visualizations from analysis.ipynb, by [groupmate].]</w:t>
+        <w:t xml:space="preserve">To be completed by Pelinsu Topaloglu — centrality rankings, community detection comparison, and network visualizations, from 02_network_analysis.ipynb.</w:t>
       </w:r>
     </w:p>
     <w:p>
       <w:pPr>
         <w:pStyle w:val="Heading2"/>
-        <w:spacing w:after="150" w:before="300"/>
+        <w:spacing w:after="100" w:before="200"/>
       </w:pPr>
       <w:r>
         <w:t xml:space="preserve">4.2 Content Analysis Results</w:t>
@@ -1282,7 +1232,7 @@
     <w:p>
       <w:pPr>
         <w:pStyle w:val="Heading3"/>
-        <w:spacing w:after="100" w:before="200"/>
+        <w:spacing w:after="80" w:before="140"/>
       </w:pPr>
       <w:r>
         <w:t xml:space="preserve">4.2.1 Sentiment Analysis</w:t>
@@ -1290,7 +1240,7 @@
     </w:p>
     <w:p>
       <w:pPr>
-        <w:spacing w:after="150"/>
+        <w:spacing w:after="100"/>
       </w:pPr>
       <w:r>
         <w:t xml:space="preserve">Overall, VADER classifies the discourse as 51.5% positive, 20.8% neutral, 27.7% negative:</w:t>
@@ -1298,7 +1248,7 @@
     </w:p>
     <w:p>
       <w:pPr>
-        <w:spacing w:after="100" w:before="200"/>
+        <w:spacing w:after="60" w:before="100"/>
         <w:jc w:val="center"/>
       </w:pPr>
       <w:r>
@@ -1344,7 +1294,7 @@
     </w:p>
     <w:p>
       <w:pPr>
-        <w:spacing w:after="300"/>
+        <w:spacing w:after="160"/>
         <w:jc w:val="center"/>
       </w:pPr>
       <w:r>
@@ -1352,29 +1302,29 @@
           <w:i/>
           <w:iCs/>
           <w:color w:val="555555"/>
-          <w:sz w:val="20"/>
-          <w:szCs w:val="20"/>
+          <w:sz w:val="19"/>
+          <w:szCs w:val="19"/>
         </w:rPr>
         <w:t xml:space="preserve">Figure 1 — Overall VADER sentiment distribution (n = 3,864 posts).</w:t>
       </w:r>
     </w:p>
     <w:p>
       <w:pPr>
-        <w:spacing w:after="150"/>
-      </w:pPr>
-      <w:r>
-        <w:t xml:space="preserve">By user type, professionals and tech users are (slightly) the most positive groups on average, not the most negative — consistent with acknowledging MT's day-to-day utility even while being most exposed to its downsides:</w:t>
-      </w:r>
-    </w:p>
-    <w:p>
-      <w:pPr>
-        <w:spacing w:after="100" w:before="200"/>
+        <w:spacing w:after="100"/>
+      </w:pPr>
+      <w:r>
+        <w:t xml:space="preserve">Professionals and tech users are (slightly) the most positive groups, not the most negative — consistent with acknowledging MT's day-to-day utility despite being most exposed to its downsides:</w:t>
+      </w:r>
+    </w:p>
+    <w:p>
+      <w:pPr>
+        <w:spacing w:after="60" w:before="100"/>
         <w:jc w:val="center"/>
       </w:pPr>
       <w:r>
         <w:drawing>
           <wp:inline distT="0" distB="0" distL="0" distR="0">
-            <wp:extent cx="4572000" cy="2828925"/>
+            <wp:extent cx="3810000" cy="2352675"/>
             <wp:effectExtent t="0" r="0" b="0" l="0"/>
             <wp:docPr id="1" name="" descr="" title=""/>
             <wp:cNvGraphicFramePr>
@@ -1399,7 +1349,7 @@
                   <pic:spPr bwMode="auto">
                     <a:xfrm>
                       <a:off x="0" y="0"/>
-                      <a:ext cx="4572000" cy="2828925"/>
+                      <a:ext cx="3810000" cy="2352675"/>
                     </a:xfrm>
                     <a:prstGeom prst="rect">
                       <a:avLst/>
@@ -1414,7 +1364,7 @@
     </w:p>
     <w:p>
       <w:pPr>
-        <w:spacing w:after="300"/>
+        <w:spacing w:after="160"/>
         <w:jc w:val="center"/>
       </w:pPr>
       <w:r>
@@ -1422,8 +1372,8 @@
           <w:i/>
           <w:iCs/>
           <w:color w:val="555555"/>
-          <w:sz w:val="20"/>
-          <w:szCs w:val="20"/>
+          <w:sz w:val="19"/>
+          <w:szCs w:val="19"/>
         </w:rPr>
         <w:t xml:space="preserve">Figure 2 — VADER sentiment distribution by user type.</w:t>
       </w:r>
@@ -1763,20 +1713,20 @@
     </w:tbl>
     <w:p>
       <w:pPr>
-        <w:spacing w:after="200"/>
-      </w:pPr>
-    </w:p>
-    <w:p>
-      <w:pPr>
-        <w:spacing w:after="150"/>
-      </w:pPr>
-      <w:r>
-        <w:t xml:space="preserve">Comparing VADER against the RoBERTa transformer model reveals the two disagree substantially — only 54.1% agreement, with 458 posts (11.9%) in outright opposite-polarity disagreement. RoBERTa's distribution is markedly less positive (23.1% positive / 46.0% neutral / 31.0% negative):</w:t>
-      </w:r>
-    </w:p>
-    <w:p>
-      <w:pPr>
-        <w:spacing w:after="100" w:before="200"/>
+        <w:spacing w:after="100"/>
+      </w:pPr>
+    </w:p>
+    <w:p>
+      <w:pPr>
+        <w:spacing w:after="100"/>
+      </w:pPr>
+      <w:r>
+        <w:t xml:space="preserve">VADER and RoBERTa disagree substantially — only 54.1% agreement, with 458 posts (11.9%) in outright opposite-polarity disagreement. RoBERTa's distribution is markedly less positive (23.1% / 46.0% / 31.0%):</w:t>
+      </w:r>
+    </w:p>
+    <w:p>
+      <w:pPr>
+        <w:spacing w:after="60" w:before="100"/>
         <w:jc w:val="center"/>
       </w:pPr>
       <w:r>
@@ -1822,7 +1772,7 @@
     </w:p>
     <w:p>
       <w:pPr>
-        <w:spacing w:after="300"/>
+        <w:spacing w:after="160"/>
         <w:jc w:val="center"/>
       </w:pPr>
       <w:r>
@@ -1830,37 +1780,37 @@
           <w:i/>
           <w:iCs/>
           <w:color w:val="555555"/>
-          <w:sz w:val="20"/>
-          <w:szCs w:val="20"/>
+          <w:sz w:val="19"/>
+          <w:szCs w:val="19"/>
         </w:rPr>
         <w:t xml:space="preserve">Figure 3 — VADER vs. RoBERTa overall sentiment distribution.</w:t>
       </w:r>
     </w:p>
     <w:p>
       <w:pPr>
-        <w:spacing w:after="150"/>
-      </w:pPr>
-      <w:r>
-        <w:t xml:space="preserve">Manual inspection of disagreements shows a consistent pattern: VADER is fooled by individually-positive words in otherwise critical or sarcastic posts. For example, VADER scored “Perfect example of how machine translation is totally untrustworthy” as strongly positive (compound +0.57, driven entirely by the word “perfect”), while RoBERTa correctly read the post as negative. This suggests RoBERTa's more balanced, less-positive distribution is the more trustworthy read of the discourse — the framing of MT is genuinely mixed, not predominantly positive as VADER alone would suggest.</w:t>
-      </w:r>
-    </w:p>
-    <w:p>
-      <w:pPr>
-        <w:spacing w:after="150"/>
-      </w:pPr>
-      <w:r>
-        <w:t xml:space="preserve">Sentiment also varies over the 12-month collection window (VADER, monthly mean compound score):</w:t>
-      </w:r>
-    </w:p>
-    <w:p>
-      <w:pPr>
-        <w:spacing w:after="100" w:before="200"/>
+        <w:spacing w:after="100"/>
+      </w:pPr>
+      <w:r>
+        <w:t xml:space="preserve">VADER is consistently fooled by individually-positive words in otherwise critical posts — e.g. it scored “Perfect example of how machine translation is totally untrustworthy” as strongly positive (+0.57, from “perfect” alone), while RoBERTa correctly read it as negative. RoBERTa's more balanced distribution is the more trustworthy read: the framing of MT is genuinely mixed, not predominantly positive.</w:t>
+      </w:r>
+    </w:p>
+    <w:p>
+      <w:pPr>
+        <w:spacing w:after="100"/>
+      </w:pPr>
+      <w:r>
+        <w:t xml:space="preserve">Sentiment also varies over the collection window (VADER, monthly mean compound score):</w:t>
+      </w:r>
+    </w:p>
+    <w:p>
+      <w:pPr>
+        <w:spacing w:after="60" w:before="100"/>
         <w:jc w:val="center"/>
       </w:pPr>
       <w:r>
         <w:drawing>
           <wp:inline distT="0" distB="0" distL="0" distR="0">
-            <wp:extent cx="4762500" cy="2343150"/>
+            <wp:extent cx="4000500" cy="1962150"/>
             <wp:effectExtent t="0" r="0" b="0" l="0"/>
             <wp:docPr id="1" name="" descr="" title=""/>
             <wp:cNvGraphicFramePr>
@@ -1885,7 +1835,7 @@
                   <pic:spPr bwMode="auto">
                     <a:xfrm>
                       <a:off x="0" y="0"/>
-                      <a:ext cx="4762500" cy="2343150"/>
+                      <a:ext cx="4000500" cy="1962150"/>
                     </a:xfrm>
                     <a:prstGeom prst="rect">
                       <a:avLst/>
@@ -1900,7 +1850,7 @@
     </w:p>
     <w:p>
       <w:pPr>
-        <w:spacing w:after="300"/>
+        <w:spacing w:after="160"/>
         <w:jc w:val="center"/>
       </w:pPr>
       <w:r>
@@ -1908,8 +1858,8 @@
           <w:i/>
           <w:iCs/>
           <w:color w:val="555555"/>
-          <w:sz w:val="20"/>
-          <w:szCs w:val="20"/>
+          <w:sz w:val="19"/>
+          <w:szCs w:val="19"/>
         </w:rPr>
         <w:t xml:space="preserve">Figure 4 — Mean VADER sentiment by month.</w:t>
       </w:r>
@@ -1917,7 +1867,7 @@
     <w:p>
       <w:pPr>
         <w:pStyle w:val="Heading3"/>
-        <w:spacing w:after="100" w:before="200"/>
+        <w:spacing w:after="80" w:before="140"/>
       </w:pPr>
       <w:r>
         <w:t xml:space="preserve">4.2.2 Emotion Analysis</w:t>
@@ -1925,7 +1875,7 @@
     </w:p>
     <w:p>
       <w:pPr>
-        <w:spacing w:after="150"/>
+        <w:spacing w:after="100"/>
       </w:pPr>
       <w:r>
         <w:t xml:space="preserve">NRCLex's overall emotion profile is dominated by trust (mean affect frequency 0.260), well above every other category:</w:t>
@@ -1933,13 +1883,13 @@
     </w:p>
     <w:p>
       <w:pPr>
-        <w:spacing w:after="100" w:before="200"/>
+        <w:spacing w:after="60" w:before="100"/>
         <w:jc w:val="center"/>
       </w:pPr>
       <w:r>
         <w:drawing>
           <wp:inline distT="0" distB="0" distL="0" distR="0">
-            <wp:extent cx="4381500" cy="2400300"/>
+            <wp:extent cx="3619500" cy="1981200"/>
             <wp:effectExtent t="0" r="0" b="0" l="0"/>
             <wp:docPr id="1" name="" descr="" title=""/>
             <wp:cNvGraphicFramePr>
@@ -1964,7 +1914,7 @@
                   <pic:spPr bwMode="auto">
                     <a:xfrm>
                       <a:off x="0" y="0"/>
-                      <a:ext cx="4381500" cy="2400300"/>
+                      <a:ext cx="3619500" cy="1981200"/>
                     </a:xfrm>
                     <a:prstGeom prst="rect">
                       <a:avLst/>
@@ -1979,7 +1929,7 @@
     </w:p>
     <w:p>
       <w:pPr>
-        <w:spacing w:after="300"/>
+        <w:spacing w:after="160"/>
         <w:jc w:val="center"/>
       </w:pPr>
       <w:r>
@@ -1987,23 +1937,23 @@
           <w:i/>
           <w:iCs/>
           <w:color w:val="555555"/>
-          <w:sz w:val="20"/>
-          <w:szCs w:val="20"/>
+          <w:sz w:val="19"/>
+          <w:szCs w:val="19"/>
         </w:rPr>
         <w:t xml:space="preserve">Figure 5 — Overall NRCLex emotion profile (mean affect frequency).</w:t>
       </w:r>
     </w:p>
     <w:p>
       <w:pPr>
-        <w:spacing w:after="150"/>
-      </w:pPr>
-      <w:r>
-        <w:t xml:space="preserve">Differences between user types are small relative to the tool-to-tool differences described below — i.e. which emotion detector is used matters more here than which audience is examined:</w:t>
-      </w:r>
-    </w:p>
-    <w:p>
-      <w:pPr>
-        <w:spacing w:after="100" w:before="200"/>
+        <w:spacing w:after="100"/>
+      </w:pPr>
+      <w:r>
+        <w:t xml:space="preserve">Differences between user types are small relative to the tool-to-tool differences below — which emotion detector is used matters more here than which audience is examined:</w:t>
+      </w:r>
+    </w:p>
+    <w:p>
+      <w:pPr>
+        <w:spacing w:after="60" w:before="100"/>
         <w:jc w:val="center"/>
       </w:pPr>
       <w:r>
@@ -2049,7 +1999,7 @@
     </w:p>
     <w:p>
       <w:pPr>
-        <w:spacing w:after="300"/>
+        <w:spacing w:after="160"/>
         <w:jc w:val="center"/>
       </w:pPr>
       <w:r>
@@ -2057,29 +2007,29 @@
           <w:i/>
           <w:iCs/>
           <w:color w:val="555555"/>
-          <w:sz w:val="20"/>
-          <w:szCs w:val="20"/>
+          <w:sz w:val="19"/>
+          <w:szCs w:val="19"/>
         </w:rPr>
         <w:t xml:space="preserve">Figure 6 — NRCLex emotion profile by user type.</w:t>
       </w:r>
     </w:p>
     <w:p>
       <w:pPr>
-        <w:spacing w:after="150"/>
-      </w:pPr>
-      <w:r>
-        <w:t xml:space="preserve">Looking at NRCLex's per-post dominant emotion (not just the mean), trust (49.0%) and fear (31.8%) together account for the large majority of posts, with anticipation a further 11.7% — every other emotion is under 4%. Comparing against DistilRoBERTa (whose dominant call is neutral for 55.5% of posts) shows the same pattern holds even when conditioning on posts where the transformer is confident enough to name a specific, non-neutral emotion: on that 44.5%-of-posts subset, NRCLex still calls trust 46.5% and fear 30.3% of the time, and the two tools agree on only 15.6% of posts:</w:t>
-      </w:r>
-    </w:p>
-    <w:p>
-      <w:pPr>
-        <w:spacing w:after="100" w:before="200"/>
+        <w:spacing w:after="100"/>
+      </w:pPr>
+      <w:r>
+        <w:t xml:space="preserve">NRCLex's per-post dominant emotion is trust (49.0%) or fear (31.8%) for the large majority of posts. Conditioning on posts where DistilRoBERTa is confident enough to name a specific non-neutral emotion (44.5% of posts) barely changes this — NRCLex still calls trust 46.5% and fear 30.3% of the time there, and the two tools agree on only 15.6% of posts:</w:t>
+      </w:r>
+    </w:p>
+    <w:p>
+      <w:pPr>
+        <w:spacing w:after="60" w:before="100"/>
         <w:jc w:val="center"/>
       </w:pPr>
       <w:r>
         <w:drawing>
           <wp:inline distT="0" distB="0" distL="0" distR="0">
-            <wp:extent cx="5334000" cy="2019300"/>
+            <wp:extent cx="4381500" cy="1657350"/>
             <wp:effectExtent t="0" r="0" b="0" l="0"/>
             <wp:docPr id="1" name="" descr="" title=""/>
             <wp:cNvGraphicFramePr>
@@ -2104,7 +2054,7 @@
                   <pic:spPr bwMode="auto">
                     <a:xfrm>
                       <a:off x="0" y="0"/>
-                      <a:ext cx="5334000" cy="2019300"/>
+                      <a:ext cx="4381500" cy="1657350"/>
                     </a:xfrm>
                     <a:prstGeom prst="rect">
                       <a:avLst/>
@@ -2119,7 +2069,7 @@
     </w:p>
     <w:p>
       <w:pPr>
-        <w:spacing w:after="300"/>
+        <w:spacing w:after="160"/>
         <w:jc w:val="center"/>
       </w:pPr>
       <w:r>
@@ -2127,24 +2077,24 @@
           <w:i/>
           <w:iCs/>
           <w:color w:val="555555"/>
-          <w:sz w:val="20"/>
-          <w:szCs w:val="20"/>
+          <w:sz w:val="19"/>
+          <w:szCs w:val="19"/>
         </w:rPr>
         <w:t xml:space="preserve">Figure 7 — NRCLex vs. DistilRoBERTa dominant-emotion distributions (each on its own full label set).</w:t>
       </w:r>
     </w:p>
     <w:p>
       <w:pPr>
-        <w:spacing w:after="150"/>
-      </w:pPr>
-      <w:r>
-        <w:t xml:space="preserve">This indicates NRCLex's dominant-emotion output is close to invariant to what a post actually says — consistent with “trust” being an oversized category in the NRC lexicon that fires on ordinary vocabulary rather than genuine trust-related content. As a result, this report treats the sentiment comparison (RQ1) as the more reliable evidence for framing, and the emotion analysis as exploratory/secondary given this tool limitation.</w:t>
+        <w:spacing w:after="100"/>
+      </w:pPr>
+      <w:r>
+        <w:t xml:space="preserve">NRCLex's dominant-emotion output is close to invariant to what a post actually says — consistent with “trust” being an oversized NRC lexicon category that fires on ordinary vocabulary. This report therefore treats the sentiment comparison (RQ1) as the more reliable evidence for framing, and emotion as exploratory/secondary.</w:t>
       </w:r>
     </w:p>
     <w:p>
       <w:pPr>
         <w:pStyle w:val="Heading3"/>
-        <w:spacing w:after="100" w:before="200"/>
+        <w:spacing w:after="80" w:before="140"/>
       </w:pPr>
       <w:r>
         <w:t xml:space="preserve">4.2.3 Named Entity Recognition</w:t>
@@ -2152,21 +2102,21 @@
     </w:p>
     <w:p>
       <w:pPr>
-        <w:spacing w:after="150"/>
-      </w:pPr>
-      <w:r>
-        <w:t xml:space="preserve">spaCy extracted 5,523 entities in the tracked categories (ORG 2,568, PERSON 1,840, GPE 979, PRODUCT 136). The most frequently mentioned organizations/products are shown below — several of these (MTPE, LLM, MTL, MT, NMT, CAT, UI, NLP, L10N, QA) are domain acronyms mis-tagged as organizations by the generic model, not real entities, and are reported as-is rather than filtered out:</w:t>
-      </w:r>
-    </w:p>
-    <w:p>
-      <w:pPr>
-        <w:spacing w:after="100" w:before="200"/>
+        <w:spacing w:after="100"/>
+      </w:pPr>
+      <w:r>
+        <w:t xml:space="preserve">spaCy extracted 5,523 entities (ORG 2,568, PERSON 1,840, GPE 979, PRODUCT 136). Several top "entities" below (MTPE, LLM, MTL, MT, NMT, CAT, UI, NLP, L10N, QA) are domain acronyms mis-tagged as organizations by the generic model, reported as-is rather than filtered out:</w:t>
+      </w:r>
+    </w:p>
+    <w:p>
+      <w:pPr>
+        <w:spacing w:after="60" w:before="100"/>
         <w:jc w:val="center"/>
       </w:pPr>
       <w:r>
         <w:drawing>
           <wp:inline distT="0" distB="0" distL="0" distR="0">
-            <wp:extent cx="4381500" cy="2895600"/>
+            <wp:extent cx="3619500" cy="2390775"/>
             <wp:effectExtent t="0" r="0" b="0" l="0"/>
             <wp:docPr id="1" name="" descr="" title=""/>
             <wp:cNvGraphicFramePr>
@@ -2191,7 +2141,7 @@
                   <pic:spPr bwMode="auto">
                     <a:xfrm>
                       <a:off x="0" y="0"/>
-                      <a:ext cx="4381500" cy="2895600"/>
+                      <a:ext cx="3619500" cy="2390775"/>
                     </a:xfrm>
                     <a:prstGeom prst="rect">
                       <a:avLst/>
@@ -2206,7 +2156,7 @@
     </w:p>
     <w:p>
       <w:pPr>
-        <w:spacing w:after="300"/>
+        <w:spacing w:after="160"/>
         <w:jc w:val="center"/>
       </w:pPr>
       <w:r>
@@ -2214,29 +2164,29 @@
           <w:i/>
           <w:iCs/>
           <w:color w:val="555555"/>
-          <w:sz w:val="20"/>
-          <w:szCs w:val="20"/>
+          <w:sz w:val="19"/>
+          <w:szCs w:val="19"/>
         </w:rPr>
         <w:t xml:space="preserve">Figure 8 — Most-mentioned raw entities (ORG/PRODUCT), including acronym noise.</w:t>
       </w:r>
     </w:p>
     <w:p>
       <w:pPr>
-        <w:spacing w:after="150"/>
-      </w:pPr>
-      <w:r>
-        <w:t xml:space="preserve">To get a cleaner answer to “which specific MT tools does each group discuss”, mentions of a small curated list of known tools/companies were counted and normalized per 1,000 posts within each user type (raw counts would otherwise just reflect that general has far more posts than the other groups):</w:t>
-      </w:r>
-    </w:p>
-    <w:p>
-      <w:pPr>
-        <w:spacing w:after="100" w:before="200"/>
+        <w:spacing w:after="100"/>
+      </w:pPr>
+      <w:r>
+        <w:t xml:space="preserve">For a cleaner answer to which specific tools each group discusses, mentions of a curated tool/company list were normalized per 1,000 posts within each user type (raw counts would just reflect that general has far more posts than the other groups):</w:t>
+      </w:r>
+    </w:p>
+    <w:p>
+      <w:pPr>
+        <w:spacing w:after="60" w:before="100"/>
         <w:jc w:val="center"/>
       </w:pPr>
       <w:r>
         <w:drawing>
           <wp:inline distT="0" distB="0" distL="0" distR="0">
-            <wp:extent cx="4381500" cy="2895600"/>
+            <wp:extent cx="3619500" cy="2390775"/>
             <wp:effectExtent t="0" r="0" b="0" l="0"/>
             <wp:docPr id="1" name="" descr="" title=""/>
             <wp:cNvGraphicFramePr>
@@ -2261,7 +2211,7 @@
                   <pic:spPr bwMode="auto">
                     <a:xfrm>
                       <a:off x="0" y="0"/>
-                      <a:ext cx="4381500" cy="2895600"/>
+                      <a:ext cx="3619500" cy="2390775"/>
                     </a:xfrm>
                     <a:prstGeom prst="rect">
                       <a:avLst/>
@@ -2276,7 +2226,7 @@
     </w:p>
     <w:p>
       <w:pPr>
-        <w:spacing w:after="300"/>
+        <w:spacing w:after="160"/>
         <w:jc w:val="center"/>
       </w:pPr>
       <w:r>
@@ -2284,8 +2234,8 @@
           <w:i/>
           <w:iCs/>
           <w:color w:val="555555"/>
-          <w:sz w:val="20"/>
-          <w:szCs w:val="20"/>
+          <w:sz w:val="19"/>
+          <w:szCs w:val="19"/>
         </w:rPr>
         <w:t xml:space="preserve">Figure 9 — Known MT tools/companies mentioned, per 1,000 posts, by user type.</w:t>
       </w:r>
@@ -3395,21 +3345,21 @@
     </w:tbl>
     <w:p>
       <w:pPr>
-        <w:spacing w:after="200"/>
-      </w:pPr>
-    </w:p>
-    <w:p>
-      <w:pPr>
-        <w:spacing w:after="150"/>
-      </w:pPr>
-      <w:r>
-        <w:t xml:space="preserve">DeepL and Google Translate dominate mentions across all groups. Tech users mention Claude and Amazon at a notably higher rate relative to their group size than general or professional users do, suggesting the tech audience's MT discussion leans more toward LLM-based translation than the dedicated MT engines professionals and the general public focus on. These counts are small in absolute terms for professional/tech/unknown (193–610 posts total), so they should be read as suggestive rather than conclusive.</w:t>
+        <w:spacing w:after="100"/>
+      </w:pPr>
+    </w:p>
+    <w:p>
+      <w:pPr>
+        <w:spacing w:after="100"/>
+      </w:pPr>
+      <w:r>
+        <w:t xml:space="preserve">DeepL and Google Translate dominate across all groups. Tech users mention Claude and Amazon at a notably higher rate relative to group size, suggesting a lean toward LLM-based translation. These counts are small in absolute terms for professional/tech/unknown (193–610 posts total) — suggestive, not conclusive.</w:t>
       </w:r>
     </w:p>
     <w:p>
       <w:pPr>
         <w:pStyle w:val="Heading3"/>
-        <w:spacing w:after="100" w:before="200"/>
+        <w:spacing w:after="80" w:before="140"/>
       </w:pPr>
       <w:r>
         <w:t xml:space="preserve">4.2.4 Word clouds by sentiment</w:t>
@@ -3417,21 +3367,13 @@
     </w:p>
     <w:p>
       <w:pPr>
-        <w:spacing w:after="150"/>
-      </w:pPr>
-      <w:r>
-        <w:t xml:space="preserve">A qualitative view of the vocabulary in positive vs. negative posts:</w:t>
-      </w:r>
-    </w:p>
-    <w:p>
-      <w:pPr>
-        <w:spacing w:after="100" w:before="200"/>
+        <w:spacing w:after="60" w:before="100"/>
         <w:jc w:val="center"/>
       </w:pPr>
       <w:r>
         <w:drawing>
           <wp:inline distT="0" distB="0" distL="0" distR="0">
-            <wp:extent cx="5334000" cy="2095500"/>
+            <wp:extent cx="4381500" cy="1724025"/>
             <wp:effectExtent t="0" r="0" b="0" l="0"/>
             <wp:docPr id="1" name="" descr="" title=""/>
             <wp:cNvGraphicFramePr>
@@ -3456,7 +3398,7 @@
                   <pic:spPr bwMode="auto">
                     <a:xfrm>
                       <a:off x="0" y="0"/>
-                      <a:ext cx="5334000" cy="2095500"/>
+                      <a:ext cx="4381500" cy="1724025"/>
                     </a:xfrm>
                     <a:prstGeom prst="rect">
                       <a:avLst/>
@@ -3471,7 +3413,7 @@
     </w:p>
     <w:p>
       <w:pPr>
-        <w:spacing w:after="300"/>
+        <w:spacing w:after="160"/>
         <w:jc w:val="center"/>
       </w:pPr>
       <w:r>
@@ -3479,8 +3421,8 @@
           <w:i/>
           <w:iCs/>
           <w:color w:val="555555"/>
-          <w:sz w:val="20"/>
-          <w:szCs w:val="20"/>
+          <w:sz w:val="19"/>
+          <w:szCs w:val="19"/>
         </w:rPr>
         <w:t xml:space="preserve">Figure 10 — Word clouds for VADER-positive (left) and VADER-negative (right) posts.</w:t>
       </w:r>
@@ -3488,7 +3430,7 @@
     <w:p>
       <w:pPr>
         <w:pStyle w:val="Heading1"/>
-        <w:spacing w:after="200" w:before="400"/>
+        <w:spacing w:after="120" w:before="260"/>
       </w:pPr>
       <w:r>
         <w:t xml:space="preserve">5. Discussion &amp; Conclusions</w:t>
@@ -3497,7 +3439,7 @@
     <w:p>
       <w:pPr>
         <w:pStyle w:val="Heading2"/>
-        <w:spacing w:after="150" w:before="300"/>
+        <w:spacing w:after="100" w:before="200"/>
       </w:pPr>
       <w:r>
         <w:t xml:space="preserve">5.1 Content analysis conclusions</w:t>
@@ -3505,40 +3447,32 @@
     </w:p>
     <w:p>
       <w:pPr>
-        <w:spacing w:after="150"/>
-      </w:pPr>
-      <w:r>
-        <w:t xml:space="preserve">RQ1 (tool vs. threat): the two sentiment tools disagree on 45.9% of posts. Taking the context-aware RoBERTa model as the more reliable signal, the discourse is genuinely mixed (23.1% positive / 46.0% neutral / 31.0% negative) rather than predominantly positive — MT is discussed as both a useful tool and, in a substantial minority of posts, negatively/critically.</w:t>
-      </w:r>
-    </w:p>
-    <w:p>
-      <w:pPr>
-        <w:spacing w:after="150"/>
-      </w:pPr>
-      <w:r>
-        <w:t xml:space="preserve">RQ2/RQ3 (professional vs. general, utility vs. displacement): professionals score most positive on average by VADER (mean compound 0.201 vs. 0.139 for general, 0.173 for tech, and 0.112 for unknown), which is consistent with professionals acknowledging MT's day-to-day utility (e.g. post-editing workflows, CAT tool integration) rather than uniformly framing it as a threat — though this is one lexicon-based signal and would benefit from being cross-checked with RoBERTa scores by user type in future work (not done in this draft).</w:t>
-      </w:r>
-    </w:p>
-    <w:p>
-      <w:pPr>
-        <w:spacing w:after="150"/>
-      </w:pPr>
-      <w:r>
-        <w:t xml:space="preserve">The emotion analysis was not able to meaningfully support or refute RQ2/RQ3: differences between user types were small compared to the disagreement between NRCLex and DistilRoBERTa, and NRCLex's own output was shown to be largely invariant to content. This is reported as a methodological finding in itself rather than a substantive result about the discourse.</w:t>
-      </w:r>
-    </w:p>
-    <w:p>
-      <w:pPr>
-        <w:spacing w:after="150"/>
-      </w:pPr>
-      <w:r>
-        <w:t xml:space="preserve">Named entity recognition shows DeepL and Google Translate as the dominant tools discussed by all groups, with tech users discussing Claude/Amazon at a disproportionately higher rate given their group size.</w:t>
+        <w:spacing w:after="100"/>
+      </w:pPr>
+      <w:r>
+        <w:t xml:space="preserve">RQ1 (tool vs. threat): the two sentiment tools disagree on 45.9% of posts. Taking the context-aware RoBERTa model as the more reliable signal, the discourse is genuinely mixed (23.1% / 46.0% / 31.0%) rather than predominantly positive — MT is discussed as both a useful tool and, in a substantial minority of posts, critically.</w:t>
+      </w:r>
+    </w:p>
+    <w:p>
+      <w:pPr>
+        <w:spacing w:after="100"/>
+      </w:pPr>
+      <w:r>
+        <w:t xml:space="preserve">RQ2/RQ3 (professional vs. general, utility vs. displacement): professionals score most positive on average (VADER mean compound 0.201 vs. 0.139 general, 0.173 tech, 0.112 unknown), consistent with acknowledging MT's day-to-day utility rather than uniformly framing it as a threat. The emotion analysis didn't meaningfully support or refute this — differences between user types were small next to the NRCLex/DistilRoBERTa disagreement, which is itself the more notable finding there.</w:t>
+      </w:r>
+    </w:p>
+    <w:p>
+      <w:pPr>
+        <w:spacing w:after="100"/>
+      </w:pPr>
+      <w:r>
+        <w:t xml:space="preserve">Named entity recognition shows DeepL and Google Translate as the dominant tools discussed by all groups, with tech users discussing Claude/Amazon disproportionately given their group size.</w:t>
       </w:r>
     </w:p>
     <w:p>
       <w:pPr>
         <w:pStyle w:val="Heading2"/>
-        <w:spacing w:after="150" w:before="300"/>
+        <w:spacing w:after="100" w:before="200"/>
       </w:pPr>
       <w:r>
         <w:t xml:space="preserve">5.2 Overall project conclusion</w:t>
@@ -3546,34 +3480,24 @@
     </w:p>
     <w:p>
       <w:pPr>
-        <w:shd w:fill="FFF2F2" w:val="clear"/>
-        <w:spacing w:after="300" w:before="100"/>
+        <w:spacing w:after="200" w:before="80"/>
       </w:pPr>
       <w:r>
         <w:rPr>
           <w:i/>
           <w:iCs/>
-          <w:color w:val="B00000"/>
+          <w:color w:val="666666"/>
         </w:rPr>
-        <w:t xml:space="preserve">[TO BE COMPLETED once the network analysis results are available — a full conclusion should relate community structure / centrality findings from analysis.ipynb to the framing and professional-vs-general differences found here.]</w:t>
+        <w:t xml:space="preserve">To be completed once the network analysis results are available, relating community structure / centrality findings to the framing and professional-vs-general differences found here.</w:t>
       </w:r>
     </w:p>
     <w:p>
       <w:pPr>
         <w:pStyle w:val="Heading1"/>
-        <w:spacing w:after="200" w:before="400"/>
+        <w:spacing w:after="120" w:before="260"/>
       </w:pPr>
       <w:r>
         <w:t xml:space="preserve">6. Limitations</w:t>
-      </w:r>
-    </w:p>
-    <w:p>
-      <w:pPr>
-        <w:pStyle w:val="Heading3"/>
-        <w:spacing w:after="100" w:before="200"/>
-      </w:pPr>
-      <w:r>
-        <w:t xml:space="preserve">Collection limitations (from the data-collection notebook)</w:t>
       </w:r>
     </w:p>
     <w:p>
@@ -3583,10 +3507,10 @@
           <w:ilvl w:val="0"/>
           <w:numId w:val="1"/>
         </w:numPr>
-        <w:spacing w:after="60"/>
-      </w:pPr>
-      <w:r>
-        <w:t xml:space="preserve">Ego-network sample: follow edges exist only around authors with ≥ 2 posts; accounts outside that set cannot have in-edges, so centrality comparisons are only valid within the post-authors subgraph.</w:t>
+        <w:spacing w:after="40"/>
+      </w:pPr>
+      <w:r>
+        <w:t xml:space="preserve">Ego-network sample: follow edges exist only around authors with ≥ 2 posts, so centrality comparisons are only valid within the post-authors subgraph. A 100-follower cap per author (visible as a spike in the in-degree distribution) and the followers-not-following crawl direction further shape the network's structure.</w:t>
       </w:r>
     </w:p>
     <w:p>
@@ -3596,10 +3520,10 @@
           <w:ilvl w:val="0"/>
           <w:numId w:val="1"/>
         </w:numPr>
-        <w:spacing w:after="60"/>
-      </w:pPr>
-      <w:r>
-        <w:t xml:space="preserve">Follower cap: at most 100 followers per author were collected, which shows up as a spike at the cap in the raw in-degree distribution.</w:t>
+        <w:spacing w:after="40"/>
+      </w:pPr>
+      <w:r>
+        <w:t xml:space="preserve">Single platform (Bluesky), one ~12-month window, and a multilingual corpus filtered by keyword rather than language — findings may not generalize, and non-English posts are intentionally kept rather than the corpus being presented as English-only.</w:t>
       </w:r>
     </w:p>
     <w:p>
@@ -3609,10 +3533,10 @@
           <w:ilvl w:val="0"/>
           <w:numId w:val="1"/>
         </w:numPr>
-        <w:spacing w:after="60"/>
-      </w:pPr>
-      <w:r>
-        <w:t xml:space="preserve">Followers, not following: the crawl collects who follows the top authors, not who those authors follow.</w:t>
+        <w:spacing w:after="40"/>
+      </w:pPr>
+      <w:r>
+        <w:t xml:space="preserve">Topical relevance filtering and author-type labeling are keyword-matching heuristics, not validated classifiers; no manual accuracy check was performed. The unknown category (Section 2.3) mitigates one failure mode — treating "no bio" as "general public" — but doesn't validate the labels that are assigned.</w:t>
       </w:r>
     </w:p>
     <w:p>
@@ -3622,10 +3546,10 @@
           <w:ilvl w:val="0"/>
           <w:numId w:val="1"/>
         </w:numPr>
-        <w:spacing w:after="60"/>
-      </w:pPr>
-      <w:r>
-        <w:t xml:space="preserve">Multilingual corpus: search queries are English, but thread replies include other languages; the relevance filter is keyword-based, not a language filter, so non-English posts are kept rather than the corpus being falsely presented as English-only.</w:t>
+        <w:spacing w:after="40"/>
+      </w:pPr>
+      <w:r>
+        <w:t xml:space="preserve">spaCy's en_core_web_sm was trained on general news text and mis-tags several domain acronyms as organizations (Section 4.2.3, reported rather than filtered out).</w:t>
       </w:r>
     </w:p>
     <w:p>
@@ -3635,10 +3559,10 @@
           <w:ilvl w:val="0"/>
           <w:numId w:val="1"/>
         </w:numPr>
-        <w:spacing w:after="60"/>
-      </w:pPr>
-      <w:r>
-        <w:t xml:space="preserve">Handles as IDs: nodes are identified by Bluesky handle, which can change over time (DIDs are stable and stored as a fallback, but not used as the primary node key).</w:t>
+        <w:spacing w:after="40"/>
+      </w:pPr>
+      <w:r>
+        <w:t xml:space="preserve">VADER and NRCLex are lexicon-based and diverge substantially from transformer alternatives (RoBERTa, DistilRoBERTa). Without gold-standard annotation we can't call either "correct" in absolute terms, only that they disagree — qualitative inspection favored the transformer models.</w:t>
       </w:r>
     </w:p>
     <w:p>
@@ -3648,19 +3572,10 @@
           <w:ilvl w:val="0"/>
           <w:numId w:val="1"/>
         </w:numPr>
-        <w:spacing w:after="60"/>
-      </w:pPr>
-      <w:r>
-        <w:t xml:space="preserve">Ethics: only public posts and public follower lists were collected, at polite request rates, via the official API.</w:t>
-      </w:r>
-    </w:p>
-    <w:p>
-      <w:pPr>
-        <w:pStyle w:val="Heading3"/>
-        <w:spacing w:after="100" w:before="200"/>
-      </w:pPr>
-      <w:r>
-        <w:t xml:space="preserve">Analysis limitations</w:t>
+        <w:spacing w:after="40"/>
+      </w:pPr>
+      <w:r>
+        <w:t xml:space="preserve">Professional (610), tech (193), and unknown (218) groups are much smaller than general (2,843); comparisons use rates rather than raw counts, but per-entity counts for the smaller groups are still small enough to be noisy.</w:t>
       </w:r>
     </w:p>
     <w:p>
@@ -3670,68 +3585,16 @@
           <w:ilvl w:val="0"/>
           <w:numId w:val="1"/>
         </w:numPr>
-        <w:spacing w:after="60"/>
-      </w:pPr>
-      <w:r>
-        <w:t xml:space="preserve">Single platform (Bluesky) and a single ~12-month window — findings may not generalize to other platforms or time periods.</w:t>
-      </w:r>
-    </w:p>
-    <w:p>
-      <w:pPr>
-        <w:pStyle w:val="ListParagraph"/>
-        <w:numPr>
-          <w:ilvl w:val="0"/>
-          <w:numId w:val="1"/>
-        </w:numPr>
-        <w:spacing w:after="60"/>
-      </w:pPr>
-      <w:r>
-        <w:t xml:space="preserve">Topical relevance filtering and author-type labeling are both simple keyword-matching heuristics over text/bio, not validated classifiers; no manual accuracy check was performed. The unknown user-type category (Section 2.3) mitigates one failure mode of this heuristic — treating "no bio" as "general public" — but doesn't validate the labels that are assigned.</w:t>
-      </w:r>
-    </w:p>
-    <w:p>
-      <w:pPr>
-        <w:pStyle w:val="ListParagraph"/>
-        <w:numPr>
-          <w:ilvl w:val="0"/>
-          <w:numId w:val="1"/>
-        </w:numPr>
-        <w:spacing w:after="60"/>
-      </w:pPr>
-      <w:r>
-        <w:t xml:space="preserve">spaCy's en_core_web_sm was trained on general news text, not localization/MT jargon, and mis-tags several domain acronyms as organizations (reported transparently in Section 4.2.3 rather than filtered out).</w:t>
-      </w:r>
-    </w:p>
-    <w:p>
-      <w:pPr>
-        <w:pStyle w:val="ListParagraph"/>
-        <w:numPr>
-          <w:ilvl w:val="0"/>
-          <w:numId w:val="1"/>
-        </w:numPr>
-        <w:spacing w:after="60"/>
-      </w:pPr>
-      <w:r>
-        <w:t xml:space="preserve">VADER and NRCLex are lexicon-based and were shown empirically to diverge substantially from transformer-based alternatives (RoBERTa, DistilRoBERTa). Without manual gold-standard annotation, we cannot say which tool is “correct” in absolute terms, only that they disagree — qualitative inspection of disagreement examples favored the transformer models.</w:t>
-      </w:r>
-    </w:p>
-    <w:p>
-      <w:pPr>
-        <w:pStyle w:val="ListParagraph"/>
-        <w:numPr>
-          <w:ilvl w:val="0"/>
-          <w:numId w:val="1"/>
-        </w:numPr>
-        <w:spacing w:after="60"/>
-      </w:pPr>
-      <w:r>
-        <w:t xml:space="preserve">Professional (610 posts), tech (193 posts), and unknown (218 posts) groups are much smaller than general (2,843 posts); all group comparisons use rates rather than raw counts for this reason, but per-entity counts for the smaller groups (Section 4.2.3) are still small enough to be noisy.</w:t>
+        <w:spacing w:after="40"/>
+      </w:pPr>
+      <w:r>
+        <w:t xml:space="preserve">Nodes are identified by Bluesky handle, not the more stable DID (stored as a fallback only). Only public posts and follower lists were collected, at polite request rates, via the official API.</w:t>
       </w:r>
     </w:p>
     <w:p>
       <w:pPr>
         <w:pStyle w:val="Heading1"/>
-        <w:spacing w:after="200" w:before="400"/>
+        <w:spacing w:after="120" w:before="260"/>
       </w:pPr>
       <w:r>
         <w:t xml:space="preserve">7. Tools and Libraries Used</w:t>
@@ -3893,7 +3756,7 @@
                 <w:bCs w:val="false"/>
                 <w:color w:val="000000"/>
               </w:rPr>
-              <w:t xml:space="preserve">[see groupmate's section]</w:t>
+              <w:t xml:space="preserve">—</w:t>
             </w:r>
           </w:p>
         </w:tc>

</xml_diff>

<commit_message>
Redundancy and consistency checks, rerun 02 and updates the report.
</commit_message>
<xml_diff>
--- a/WSA_Project_Report_DRAFT.docx
+++ b/WSA_Project_Report_DRAFT.docx
@@ -1,6 +1,6 @@
 
 <file path=word/document.xml><?xml version="1.0" encoding="utf-8"?>
-<w:document xmlns:wpc="http://schemas.microsoft.com/office/word/2010/wordprocessingCanvas" xmlns:cx="http://schemas.microsoft.com/office/drawing/2014/chartex" xmlns:cx1="http://schemas.microsoft.com/office/drawing/2015/9/8/chartex" xmlns:cx2="http://schemas.microsoft.com/office/drawing/2015/10/21/chartex" xmlns:cx3="http://schemas.microsoft.com/office/drawing/2016/5/9/chartex" xmlns:cx4="http://schemas.microsoft.com/office/drawing/2016/5/10/chartex" xmlns:cx5="http://schemas.microsoft.com/office/drawing/2016/5/11/chartex" xmlns:cx6="http://schemas.microsoft.com/office/drawing/2016/5/12/chartex" xmlns:cx7="http://schemas.microsoft.com/office/drawing/2016/5/13/chartex" xmlns:cx8="http://schemas.microsoft.com/office/drawing/2016/5/14/chartex" xmlns:mc="http://schemas.openxmlformats.org/markup-compatibility/2006" xmlns:aink="http://schemas.microsoft.com/office/drawing/2016/ink" xmlns:am3d="http://schemas.microsoft.com/office/drawing/2017/model3d" xmlns:o="urn:schemas-microsoft-com:office:office" xmlns:oel="http://schemas.microsoft.com/office/2019/extlst" xmlns:r="http://schemas.openxmlformats.org/officeDocument/2006/relationships" xmlns:m="http://schemas.openxmlformats.org/officeDocument/2006/math" xmlns:v="urn:schemas-microsoft-com:vml" xmlns:wp14="http://schemas.microsoft.com/office/word/2010/wordprocessingDrawing" xmlns:wp="http://schemas.openxmlformats.org/drawingml/2006/wordprocessingDrawing" xmlns:w10="urn:schemas-microsoft-com:office:word" xmlns:w="http://schemas.openxmlformats.org/wordprocessingml/2006/main" xmlns:w14="http://schemas.microsoft.com/office/word/2010/wordml" xmlns:w15="http://schemas.microsoft.com/office/word/2012/wordml" xmlns:w16cex="http://schemas.microsoft.com/office/word/2018/wordml/cex" xmlns:w16cid="http://schemas.microsoft.com/office/word/2016/wordml/cid" xmlns:w16="http://schemas.microsoft.com/office/word/2018/wordml" xmlns:w16sdtdh="http://schemas.microsoft.com/office/word/2020/wordml/sdtdatahash" xmlns:w16se="http://schemas.microsoft.com/office/word/2015/wordml/symex" xmlns:wpg="http://schemas.microsoft.com/office/word/2010/wordprocessingGroup" xmlns:wpi="http://schemas.microsoft.com/office/word/2010/wordprocessingInk" xmlns:wne="http://schemas.microsoft.com/office/word/2006/wordml" xmlns:wps="http://schemas.microsoft.com/office/word/2010/wordprocessingShape" mc:Ignorable="w14 w15 w16se w16cid w16 w16cex w16sdtdh wp14">
+<w:document xmlns:wpc="http://schemas.microsoft.com/office/word/2010/wordprocessingCanvas" xmlns:cx="http://schemas.microsoft.com/office/drawing/2014/chartex" xmlns:cx1="http://schemas.microsoft.com/office/drawing/2015/9/8/chartex" xmlns:cx2="http://schemas.microsoft.com/office/drawing/2015/10/21/chartex" xmlns:cx3="http://schemas.microsoft.com/office/drawing/2016/5/9/chartex" xmlns:cx4="http://schemas.microsoft.com/office/drawing/2016/5/10/chartex" xmlns:cx5="http://schemas.microsoft.com/office/drawing/2016/5/11/chartex" xmlns:cx6="http://schemas.microsoft.com/office/drawing/2016/5/12/chartex" xmlns:cx7="http://schemas.microsoft.com/office/drawing/2016/5/13/chartex" xmlns:cx8="http://schemas.microsoft.com/office/drawing/2016/5/14/chartex" xmlns:mc="http://schemas.openxmlformats.org/markup-compatibility/2006" xmlns:m="http://schemas.openxmlformats.org/officeDocument/2006/math" xmlns:aink="http://schemas.microsoft.com/office/drawing/2016/ink" xmlns:am3d="http://schemas.microsoft.com/office/drawing/2017/model3d" xmlns:oel="http://schemas.microsoft.com/office/2019/extlst" xmlns:r="http://schemas.openxmlformats.org/officeDocument/2006/relationships" xmlns:wp14="http://schemas.microsoft.com/office/word/2010/wordprocessingDrawing" xmlns:wp="http://schemas.openxmlformats.org/drawingml/2006/wordprocessingDrawing" xmlns:wpg="http://schemas.microsoft.com/office/word/2010/wordprocessingGroup" xmlns:wpi="http://schemas.microsoft.com/office/word/2010/wordprocessingInk" xmlns:wps="http://schemas.microsoft.com/office/word/2010/wordprocessingShape" xmlns:o="urn:schemas-microsoft-com:office:office" xmlns:v="urn:schemas-microsoft-com:vml" xmlns:w10="urn:schemas-microsoft-com:office:word" xmlns:w="http://schemas.openxmlformats.org/wordprocessingml/2006/main" xmlns:w14="http://schemas.microsoft.com/office/word/2010/wordml" xmlns:w15="http://schemas.microsoft.com/office/word/2012/wordml" xmlns:w16cex="http://schemas.microsoft.com/office/word/2018/wordml/cex" xmlns:w16cid="http://schemas.microsoft.com/office/word/2016/wordml/cid" xmlns:w16="http://schemas.microsoft.com/office/word/2018/wordml" xmlns:w16sdtdh="http://schemas.microsoft.com/office/word/2020/wordml/sdtdatahash" xmlns:w16sdtfl="http://schemas.microsoft.com/office/word/2024/wordml/sdtformatlock" xmlns:w16se="http://schemas.microsoft.com/office/word/2015/wordml/symex" xmlns:w16du="http://schemas.microsoft.com/office/word/2023/wordml/word16du" xmlns:wne="http://schemas.microsoft.com/office/word/2006/wordml" mc:Ignorable="w14 w15 w16se w16cid w16 w16cex w16sdtdh w16sdtfl w16du wp14">
   <w:body>
     <w:p>
       <w:pPr>
@@ -370,12 +370,6 @@
         <w:gridCol w:w="5000"/>
       </w:tblGrid>
       <w:tr>
-        <w:tblPrEx>
-          <w:tblCellMar>
-            <w:top w:w="0" w:type="dxa"/>
-            <w:bottom w:w="0" w:type="dxa"/>
-          </w:tblCellMar>
-        </w:tblPrEx>
         <w:tc>
           <w:tcPr>
             <w:tcW w:w="3200" w:type="dxa"/>
@@ -426,12 +420,6 @@
         </w:tc>
       </w:tr>
       <w:tr>
-        <w:tblPrEx>
-          <w:tblCellMar>
-            <w:top w:w="0" w:type="dxa"/>
-            <w:bottom w:w="0" w:type="dxa"/>
-          </w:tblCellMar>
-        </w:tblPrEx>
         <w:tc>
           <w:tcPr>
             <w:tcW w:w="3200" w:type="dxa"/>
@@ -473,12 +461,6 @@
         </w:tc>
       </w:tr>
       <w:tr>
-        <w:tblPrEx>
-          <w:tblCellMar>
-            <w:top w:w="0" w:type="dxa"/>
-            <w:bottom w:w="0" w:type="dxa"/>
-          </w:tblCellMar>
-        </w:tblPrEx>
         <w:tc>
           <w:tcPr>
             <w:tcW w:w="3200" w:type="dxa"/>
@@ -520,12 +502,6 @@
         </w:tc>
       </w:tr>
       <w:tr>
-        <w:tblPrEx>
-          <w:tblCellMar>
-            <w:top w:w="0" w:type="dxa"/>
-            <w:bottom w:w="0" w:type="dxa"/>
-          </w:tblCellMar>
-        </w:tblPrEx>
         <w:tc>
           <w:tcPr>
             <w:tcW w:w="3200" w:type="dxa"/>
@@ -567,12 +543,6 @@
         </w:tc>
       </w:tr>
       <w:tr>
-        <w:tblPrEx>
-          <w:tblCellMar>
-            <w:top w:w="0" w:type="dxa"/>
-            <w:bottom w:w="0" w:type="dxa"/>
-          </w:tblCellMar>
-        </w:tblPrEx>
         <w:tc>
           <w:tcPr>
             <w:tcW w:w="3200" w:type="dxa"/>
@@ -614,12 +584,6 @@
         </w:tc>
       </w:tr>
       <w:tr>
-        <w:tblPrEx>
-          <w:tblCellMar>
-            <w:top w:w="0" w:type="dxa"/>
-            <w:bottom w:w="0" w:type="dxa"/>
-          </w:tblCellMar>
-        </w:tblPrEx>
         <w:tc>
           <w:tcPr>
             <w:tcW w:w="3200" w:type="dxa"/>
@@ -661,12 +625,6 @@
         </w:tc>
       </w:tr>
       <w:tr>
-        <w:tblPrEx>
-          <w:tblCellMar>
-            <w:top w:w="0" w:type="dxa"/>
-            <w:bottom w:w="0" w:type="dxa"/>
-          </w:tblCellMar>
-        </w:tblPrEx>
         <w:tc>
           <w:tcPr>
             <w:tcW w:w="3200" w:type="dxa"/>
@@ -708,12 +666,6 @@
         </w:tc>
       </w:tr>
       <w:tr>
-        <w:tblPrEx>
-          <w:tblCellMar>
-            <w:top w:w="0" w:type="dxa"/>
-            <w:bottom w:w="0" w:type="dxa"/>
-          </w:tblCellMar>
-        </w:tblPrEx>
         <w:tc>
           <w:tcPr>
             <w:tcW w:w="3200" w:type="dxa"/>
@@ -791,12 +743,6 @@
         <w:gridCol w:w="2000"/>
       </w:tblGrid>
       <w:tr>
-        <w:tblPrEx>
-          <w:tblCellMar>
-            <w:top w:w="0" w:type="dxa"/>
-            <w:bottom w:w="0" w:type="dxa"/>
-          </w:tblCellMar>
-        </w:tblPrEx>
         <w:tc>
           <w:tcPr>
             <w:tcW w:w="3200" w:type="dxa"/>
@@ -847,12 +793,6 @@
         </w:tc>
       </w:tr>
       <w:tr>
-        <w:tblPrEx>
-          <w:tblCellMar>
-            <w:top w:w="0" w:type="dxa"/>
-            <w:bottom w:w="0" w:type="dxa"/>
-          </w:tblCellMar>
-        </w:tblPrEx>
         <w:tc>
           <w:tcPr>
             <w:tcW w:w="3200" w:type="dxa"/>
@@ -894,12 +834,6 @@
         </w:tc>
       </w:tr>
       <w:tr>
-        <w:tblPrEx>
-          <w:tblCellMar>
-            <w:top w:w="0" w:type="dxa"/>
-            <w:bottom w:w="0" w:type="dxa"/>
-          </w:tblCellMar>
-        </w:tblPrEx>
         <w:tc>
           <w:tcPr>
             <w:tcW w:w="3200" w:type="dxa"/>
@@ -941,12 +875,6 @@
         </w:tc>
       </w:tr>
       <w:tr>
-        <w:tblPrEx>
-          <w:tblCellMar>
-            <w:top w:w="0" w:type="dxa"/>
-            <w:bottom w:w="0" w:type="dxa"/>
-          </w:tblCellMar>
-        </w:tblPrEx>
         <w:tc>
           <w:tcPr>
             <w:tcW w:w="3200" w:type="dxa"/>
@@ -988,12 +916,6 @@
         </w:tc>
       </w:tr>
       <w:tr>
-        <w:tblPrEx>
-          <w:tblCellMar>
-            <w:top w:w="0" w:type="dxa"/>
-            <w:bottom w:w="0" w:type="dxa"/>
-          </w:tblCellMar>
-        </w:tblPrEx>
         <w:tc>
           <w:tcPr>
             <w:tcW w:w="3200" w:type="dxa"/>
@@ -1068,7 +990,7 @@
     </w:p>
     <w:p>
       <w:r>
-        <w:t>Network analysis is carried out in 02_network_analysis_revised.ipynb using networkx. Placeholder accounts (handle.invalid, Bluesky’s marker for deleted or unresolvable accounts) are excluded, and two graphs are built and kept separate — following and replying are different social relations, and merging them into a single directed graph would silently collapse duplicate source–target pairs:</w:t>
+        <w:t>Network analysis is carried out in 02_network_analysis.ipynb using networkx. Placeholder accounts (handle.invalid, Bluesky’s marker for deleted or unresolvable accounts) are excluded, and two graphs are built and kept separate — following and replying are different social relations, and merging them into a single directed graph would silently collapse duplicate source–target pairs:</w:t>
       </w:r>
     </w:p>
     <w:p>
@@ -1146,6 +1068,7 @@
         </w:numPr>
       </w:pPr>
       <w:r>
+        <w:lastRenderedPageBreak/>
         <w:t>Betweenness centrality — accounts lying on many shortest paths, i.e., bridges between parts of the network (directly relevant to RQ4).</w:t>
       </w:r>
     </w:p>
@@ -1278,7 +1201,6 @@
         <w:spacing w:after="100"/>
       </w:pPr>
       <w:r>
-        <w:lastRenderedPageBreak/>
         <w:t>Comparing the two by restricting both to the shared 6 labels would introduce selection bias, since trust/anticipation are NRCLex's most common calls. Instead, the comparison conditions only on the transformer's output, then checks what NRCLex independently says about those same posts.</w:t>
       </w:r>
     </w:p>
@@ -1350,6 +1272,7 @@
     </w:p>
     <w:p>
       <w:r>
+        <w:lastRenderedPageBreak/>
         <w:t>The degree distribution of the post-authors subgraph is heavy-tailed (approximately linear CCDF on log-log axes): attention concentrates on a few accounts. The spike at in-degree ≈ 100 in the full crawl is the follower-crawl pagination cap — a collection artifact, not a property of Bluesky (Figure 1).</w:t>
       </w:r>
     </w:p>
@@ -1358,22 +1281,26 @@
         <w:jc w:val="center"/>
       </w:pPr>
       <w:r>
+        <w:rPr>
+          <w:noProof/>
+        </w:rPr>
         <w:drawing>
-          <wp:inline xmlns:a="http://schemas.openxmlformats.org/drawingml/2006/main" xmlns:pic="http://schemas.openxmlformats.org/drawingml/2006/picture">
+          <wp:inline distT="0" distB="0" distL="0" distR="0" wp14:anchorId="51614BE5" wp14:editId="1CA9623E">
             <wp:extent cx="4389120" cy="1665073"/>
+            <wp:effectExtent l="0" t="0" r="0" b="0"/>
             <wp:docPr id="1865554329" name="Picture 1865554329"/>
             <wp:cNvGraphicFramePr>
-              <a:graphicFrameLocks noChangeAspect="1"/>
+              <a:graphicFrameLocks xmlns:a="http://schemas.openxmlformats.org/drawingml/2006/main" noChangeAspect="1"/>
             </wp:cNvGraphicFramePr>
-            <a:graphic>
+            <a:graphic xmlns:a="http://schemas.openxmlformats.org/drawingml/2006/main">
               <a:graphicData uri="http://schemas.openxmlformats.org/drawingml/2006/picture">
-                <pic:pic>
+                <pic:pic xmlns:pic="http://schemas.openxmlformats.org/drawingml/2006/picture">
                   <pic:nvPicPr>
                     <pic:cNvPr id="0" name="cell32.png"/>
                     <pic:cNvPicPr/>
                   </pic:nvPicPr>
                   <pic:blipFill>
-                    <a:blip r:embed="rId17"/>
+                    <a:blip r:embed="rId5"/>
                     <a:stretch>
                       <a:fillRect/>
                     </a:stretch>
@@ -1383,7 +1310,9 @@
                       <a:off x="0" y="0"/>
                       <a:ext cx="4389120" cy="1665073"/>
                     </a:xfrm>
-                    <a:prstGeom prst="rect"/>
+                    <a:prstGeom prst="rect">
+                      <a:avLst/>
+                    </a:prstGeom>
                   </pic:spPr>
                 </pic:pic>
               </a:graphicData>
@@ -1435,14 +1364,14 @@
         <w:tblLook w:val="04A0" w:firstRow="1" w:lastRow="0" w:firstColumn="1" w:lastColumn="0" w:noHBand="0" w:noVBand="1"/>
       </w:tblPr>
       <w:tblGrid>
-        <w:gridCol w:w="3249"/>
-        <w:gridCol w:w="3249"/>
-        <w:gridCol w:w="3249"/>
+        <w:gridCol w:w="2848"/>
+        <w:gridCol w:w="2123"/>
+        <w:gridCol w:w="2229"/>
       </w:tblGrid>
       <w:tr>
         <w:tc>
           <w:tcPr>
-            <w:tcW w:type="dxa" w:w="3249"/>
+            <w:tcW w:w="3249" w:type="dxa"/>
           </w:tcPr>
           <w:p>
             <w:r>
@@ -1455,7 +1384,7 @@
         </w:tc>
         <w:tc>
           <w:tcPr>
-            <w:tcW w:type="dxa" w:w="3249"/>
+            <w:tcW w:w="3249" w:type="dxa"/>
           </w:tcPr>
           <w:p>
             <w:r>
@@ -1468,7 +1397,7 @@
         </w:tc>
         <w:tc>
           <w:tcPr>
-            <w:tcW w:type="dxa" w:w="3249"/>
+            <w:tcW w:w="3249" w:type="dxa"/>
           </w:tcPr>
           <w:p>
             <w:r>
@@ -1483,7 +1412,7 @@
       <w:tr>
         <w:tc>
           <w:tcPr>
-            <w:tcW w:type="dxa" w:w="3249"/>
+            <w:tcW w:w="3249" w:type="dxa"/>
           </w:tcPr>
           <w:p>
             <w:r>
@@ -1493,7 +1422,7 @@
         </w:tc>
         <w:tc>
           <w:tcPr>
-            <w:tcW w:type="dxa" w:w="3249"/>
+            <w:tcW w:w="3249" w:type="dxa"/>
           </w:tcPr>
           <w:p>
             <w:r>
@@ -1503,7 +1432,7 @@
         </w:tc>
         <w:tc>
           <w:tcPr>
-            <w:tcW w:type="dxa" w:w="3249"/>
+            <w:tcW w:w="3249" w:type="dxa"/>
           </w:tcPr>
           <w:p>
             <w:r>
@@ -1515,7 +1444,7 @@
       <w:tr>
         <w:tc>
           <w:tcPr>
-            <w:tcW w:type="dxa" w:w="3249"/>
+            <w:tcW w:w="3249" w:type="dxa"/>
           </w:tcPr>
           <w:p>
             <w:r>
@@ -1525,7 +1454,7 @@
         </w:tc>
         <w:tc>
           <w:tcPr>
-            <w:tcW w:type="dxa" w:w="3249"/>
+            <w:tcW w:w="3249" w:type="dxa"/>
           </w:tcPr>
           <w:p>
             <w:r>
@@ -1535,7 +1464,7 @@
         </w:tc>
         <w:tc>
           <w:tcPr>
-            <w:tcW w:type="dxa" w:w="3249"/>
+            <w:tcW w:w="3249" w:type="dxa"/>
           </w:tcPr>
           <w:p>
             <w:r>
@@ -1547,7 +1476,7 @@
       <w:tr>
         <w:tc>
           <w:tcPr>
-            <w:tcW w:type="dxa" w:w="3249"/>
+            <w:tcW w:w="3249" w:type="dxa"/>
           </w:tcPr>
           <w:p>
             <w:r>
@@ -1557,7 +1486,7 @@
         </w:tc>
         <w:tc>
           <w:tcPr>
-            <w:tcW w:type="dxa" w:w="3249"/>
+            <w:tcW w:w="3249" w:type="dxa"/>
           </w:tcPr>
           <w:p>
             <w:r>
@@ -1567,7 +1496,7 @@
         </w:tc>
         <w:tc>
           <w:tcPr>
-            <w:tcW w:type="dxa" w:w="3249"/>
+            <w:tcW w:w="3249" w:type="dxa"/>
           </w:tcPr>
           <w:p>
             <w:r>
@@ -1579,7 +1508,7 @@
       <w:tr>
         <w:tc>
           <w:tcPr>
-            <w:tcW w:type="dxa" w:w="3249"/>
+            <w:tcW w:w="3249" w:type="dxa"/>
           </w:tcPr>
           <w:p>
             <w:r>
@@ -1589,7 +1518,7 @@
         </w:tc>
         <w:tc>
           <w:tcPr>
-            <w:tcW w:type="dxa" w:w="3249"/>
+            <w:tcW w:w="3249" w:type="dxa"/>
           </w:tcPr>
           <w:p>
             <w:r>
@@ -1599,7 +1528,7 @@
         </w:tc>
         <w:tc>
           <w:tcPr>
-            <w:tcW w:type="dxa" w:w="3249"/>
+            <w:tcW w:w="3249" w:type="dxa"/>
           </w:tcPr>
           <w:p>
             <w:r>
@@ -1611,7 +1540,7 @@
       <w:tr>
         <w:tc>
           <w:tcPr>
-            <w:tcW w:type="dxa" w:w="3249"/>
+            <w:tcW w:w="3249" w:type="dxa"/>
           </w:tcPr>
           <w:p>
             <w:r>
@@ -1621,7 +1550,7 @@
         </w:tc>
         <w:tc>
           <w:tcPr>
-            <w:tcW w:type="dxa" w:w="3249"/>
+            <w:tcW w:w="3249" w:type="dxa"/>
           </w:tcPr>
           <w:p>
             <w:r>
@@ -1631,7 +1560,7 @@
         </w:tc>
         <w:tc>
           <w:tcPr>
-            <w:tcW w:type="dxa" w:w="3249"/>
+            <w:tcW w:w="3249" w:type="dxa"/>
           </w:tcPr>
           <w:p>
             <w:r>
@@ -1643,7 +1572,7 @@
       <w:tr>
         <w:tc>
           <w:tcPr>
-            <w:tcW w:type="dxa" w:w="3249"/>
+            <w:tcW w:w="3249" w:type="dxa"/>
           </w:tcPr>
           <w:p>
             <w:r>
@@ -1653,7 +1582,7 @@
         </w:tc>
         <w:tc>
           <w:tcPr>
-            <w:tcW w:type="dxa" w:w="3249"/>
+            <w:tcW w:w="3249" w:type="dxa"/>
           </w:tcPr>
           <w:p>
             <w:r>
@@ -1663,7 +1592,7 @@
         </w:tc>
         <w:tc>
           <w:tcPr>
-            <w:tcW w:type="dxa" w:w="3249"/>
+            <w:tcW w:w="3249" w:type="dxa"/>
           </w:tcPr>
           <w:p>
             <w:r>
@@ -1675,7 +1604,7 @@
       <w:tr>
         <w:tc>
           <w:tcPr>
-            <w:tcW w:type="dxa" w:w="3249"/>
+            <w:tcW w:w="3249" w:type="dxa"/>
           </w:tcPr>
           <w:p>
             <w:r>
@@ -1685,7 +1614,7 @@
         </w:tc>
         <w:tc>
           <w:tcPr>
-            <w:tcW w:type="dxa" w:w="3249"/>
+            <w:tcW w:w="3249" w:type="dxa"/>
           </w:tcPr>
           <w:p>
             <w:r>
@@ -1695,7 +1624,7 @@
         </w:tc>
         <w:tc>
           <w:tcPr>
-            <w:tcW w:type="dxa" w:w="3249"/>
+            <w:tcW w:w="3249" w:type="dxa"/>
           </w:tcPr>
           <w:p>
             <w:r>
@@ -1707,7 +1636,7 @@
       <w:tr>
         <w:tc>
           <w:tcPr>
-            <w:tcW w:type="dxa" w:w="3249"/>
+            <w:tcW w:w="3249" w:type="dxa"/>
           </w:tcPr>
           <w:p>
             <w:r>
@@ -1717,7 +1646,7 @@
         </w:tc>
         <w:tc>
           <w:tcPr>
-            <w:tcW w:type="dxa" w:w="3249"/>
+            <w:tcW w:w="3249" w:type="dxa"/>
           </w:tcPr>
           <w:p>
             <w:r>
@@ -1727,7 +1656,7 @@
         </w:tc>
         <w:tc>
           <w:tcPr>
-            <w:tcW w:type="dxa" w:w="3249"/>
+            <w:tcW w:w="3249" w:type="dxa"/>
           </w:tcPr>
           <w:p>
             <w:r>
@@ -1739,7 +1668,7 @@
       <w:tr>
         <w:tc>
           <w:tcPr>
-            <w:tcW w:type="dxa" w:w="3249"/>
+            <w:tcW w:w="3249" w:type="dxa"/>
           </w:tcPr>
           <w:p>
             <w:r>
@@ -1749,7 +1678,7 @@
         </w:tc>
         <w:tc>
           <w:tcPr>
-            <w:tcW w:type="dxa" w:w="3249"/>
+            <w:tcW w:w="3249" w:type="dxa"/>
           </w:tcPr>
           <w:p>
             <w:r>
@@ -1759,7 +1688,7 @@
         </w:tc>
         <w:tc>
           <w:tcPr>
-            <w:tcW w:type="dxa" w:w="3249"/>
+            <w:tcW w:w="3249" w:type="dxa"/>
           </w:tcPr>
           <w:p>
             <w:r>
@@ -1771,7 +1700,7 @@
       <w:tr>
         <w:tc>
           <w:tcPr>
-            <w:tcW w:type="dxa" w:w="3249"/>
+            <w:tcW w:w="3249" w:type="dxa"/>
           </w:tcPr>
           <w:p>
             <w:r>
@@ -1781,7 +1710,7 @@
         </w:tc>
         <w:tc>
           <w:tcPr>
-            <w:tcW w:type="dxa" w:w="3249"/>
+            <w:tcW w:w="3249" w:type="dxa"/>
           </w:tcPr>
           <w:p>
             <w:r>
@@ -1791,7 +1720,7 @@
         </w:tc>
         <w:tc>
           <w:tcPr>
-            <w:tcW w:type="dxa" w:w="3249"/>
+            <w:tcW w:w="3249" w:type="dxa"/>
           </w:tcPr>
           <w:p>
             <w:r>
@@ -1803,7 +1732,7 @@
     </w:tbl>
     <w:p>
       <w:r>
-        <w:t>The reply network inverts this picture: the most replied-to accounts are mostly general users, led by a single viral outlier (tobyfox.undertale.com, 364 replies received — 10× the runner-up), a one-off thread that attracted replies from far outside the translation community. Professionals are followed; virality happens around general accounts. The outlier is treated as an event rather than a structural property, and the visualization below is restricted to post authors with degree ≥ 2 so the viral spike does not swamp the layout (Figure 2).</w:t>
+        <w:t>The reply network inverts this picture: the most replied-to accounts are mostly general users, led by a single viral outlier (tobyfox.undertale.com, 364 replies received — about 5.6× the runner-up), a one-off thread that attracted replies from far outside the translation community. Professionals are followed; virality happens around general accounts. The outlier is treated as an event rather than a structural property, and the visualization below is restricted to post authors with degree ≥ 2 so the viral spike does not swamp the layout (Figure 2).</w:t>
       </w:r>
     </w:p>
     <w:p>
@@ -1811,22 +1740,27 @@
         <w:jc w:val="center"/>
       </w:pPr>
       <w:r>
+        <w:rPr>
+          <w:noProof/>
+        </w:rPr>
+        <w:lastRenderedPageBreak/>
         <w:drawing>
-          <wp:inline xmlns:a="http://schemas.openxmlformats.org/drawingml/2006/main" xmlns:pic="http://schemas.openxmlformats.org/drawingml/2006/picture">
+          <wp:inline distT="0" distB="0" distL="0" distR="0" wp14:anchorId="292A9408" wp14:editId="617DB086">
             <wp:extent cx="4023360" cy="3086969"/>
+            <wp:effectExtent l="0" t="0" r="0" b="0"/>
             <wp:docPr id="1865554330" name="Picture 1865554330"/>
             <wp:cNvGraphicFramePr>
-              <a:graphicFrameLocks noChangeAspect="1"/>
+              <a:graphicFrameLocks xmlns:a="http://schemas.openxmlformats.org/drawingml/2006/main" noChangeAspect="1"/>
             </wp:cNvGraphicFramePr>
-            <a:graphic>
+            <a:graphic xmlns:a="http://schemas.openxmlformats.org/drawingml/2006/main">
               <a:graphicData uri="http://schemas.openxmlformats.org/drawingml/2006/picture">
-                <pic:pic>
+                <pic:pic xmlns:pic="http://schemas.openxmlformats.org/drawingml/2006/picture">
                   <pic:nvPicPr>
                     <pic:cNvPr id="0" name="cell30.png"/>
                     <pic:cNvPicPr/>
                   </pic:nvPicPr>
                   <pic:blipFill>
-                    <a:blip r:embed="rId18"/>
+                    <a:blip r:embed="rId6"/>
                     <a:stretch>
                       <a:fillRect/>
                     </a:stretch>
@@ -1836,7 +1770,9 @@
                       <a:off x="0" y="0"/>
                       <a:ext cx="4023360" cy="3086969"/>
                     </a:xfrm>
-                    <a:prstGeom prst="rect"/>
+                    <a:prstGeom prst="rect">
+                      <a:avLst/>
+                    </a:prstGeom>
                   </pic:spPr>
                 </pic:pic>
               </a:graphicData>
@@ -1888,15 +1824,15 @@
         <w:tblLook w:val="04A0" w:firstRow="1" w:lastRow="0" w:firstColumn="1" w:lastColumn="0" w:noHBand="0" w:noVBand="1"/>
       </w:tblPr>
       <w:tblGrid>
-        <w:gridCol w:w="2436"/>
-        <w:gridCol w:w="2436"/>
-        <w:gridCol w:w="2436"/>
-        <w:gridCol w:w="2436"/>
+        <w:gridCol w:w="1742"/>
+        <w:gridCol w:w="1850"/>
+        <w:gridCol w:w="1850"/>
+        <w:gridCol w:w="1758"/>
       </w:tblGrid>
       <w:tr>
         <w:tc>
           <w:tcPr>
-            <w:tcW w:type="dxa" w:w="2436"/>
+            <w:tcW w:w="2436" w:type="dxa"/>
           </w:tcPr>
           <w:p>
             <w:r>
@@ -1909,7 +1845,7 @@
         </w:tc>
         <w:tc>
           <w:tcPr>
-            <w:tcW w:type="dxa" w:w="2436"/>
+            <w:tcW w:w="2436" w:type="dxa"/>
           </w:tcPr>
           <w:p>
             <w:r>
@@ -1922,7 +1858,7 @@
         </w:tc>
         <w:tc>
           <w:tcPr>
-            <w:tcW w:type="dxa" w:w="2436"/>
+            <w:tcW w:w="2436" w:type="dxa"/>
           </w:tcPr>
           <w:p>
             <w:r>
@@ -1935,7 +1871,7 @@
         </w:tc>
         <w:tc>
           <w:tcPr>
-            <w:tcW w:type="dxa" w:w="2436"/>
+            <w:tcW w:w="2436" w:type="dxa"/>
           </w:tcPr>
           <w:p>
             <w:r>
@@ -1950,7 +1886,7 @@
       <w:tr>
         <w:tc>
           <w:tcPr>
-            <w:tcW w:type="dxa" w:w="2436"/>
+            <w:tcW w:w="2436" w:type="dxa"/>
           </w:tcPr>
           <w:p>
             <w:r>
@@ -1960,7 +1896,7 @@
         </w:tc>
         <w:tc>
           <w:tcPr>
-            <w:tcW w:type="dxa" w:w="2436"/>
+            <w:tcW w:w="2436" w:type="dxa"/>
           </w:tcPr>
           <w:p>
             <w:r>
@@ -1970,7 +1906,7 @@
         </w:tc>
         <w:tc>
           <w:tcPr>
-            <w:tcW w:type="dxa" w:w="2436"/>
+            <w:tcW w:w="2436" w:type="dxa"/>
           </w:tcPr>
           <w:p>
             <w:r>
@@ -1980,11 +1916,11 @@
         </w:tc>
         <w:tc>
           <w:tcPr>
-            <w:tcW w:type="dxa" w:w="2436"/>
-          </w:tcPr>
-          <w:p>
-            <w:r>
-              <w:t>0.737</w:t>
+            <w:tcW w:w="2436" w:type="dxa"/>
+          </w:tcPr>
+          <w:p>
+            <w:r>
+              <w:t>0.728</w:t>
             </w:r>
           </w:p>
         </w:tc>
@@ -1992,7 +1928,7 @@
       <w:tr>
         <w:tc>
           <w:tcPr>
-            <w:tcW w:type="dxa" w:w="2436"/>
+            <w:tcW w:w="2436" w:type="dxa"/>
           </w:tcPr>
           <w:p>
             <w:r>
@@ -2002,7 +1938,7 @@
         </w:tc>
         <w:tc>
           <w:tcPr>
-            <w:tcW w:type="dxa" w:w="2436"/>
+            <w:tcW w:w="2436" w:type="dxa"/>
           </w:tcPr>
           <w:p>
             <w:r>
@@ -2012,7 +1948,7 @@
         </w:tc>
         <w:tc>
           <w:tcPr>
-            <w:tcW w:type="dxa" w:w="2436"/>
+            <w:tcW w:w="2436" w:type="dxa"/>
           </w:tcPr>
           <w:p>
             <w:r>
@@ -2022,7 +1958,7 @@
         </w:tc>
         <w:tc>
           <w:tcPr>
-            <w:tcW w:type="dxa" w:w="2436"/>
+            <w:tcW w:w="2436" w:type="dxa"/>
           </w:tcPr>
           <w:p>
             <w:r>
@@ -2034,7 +1970,7 @@
       <w:tr>
         <w:tc>
           <w:tcPr>
-            <w:tcW w:type="dxa" w:w="2436"/>
+            <w:tcW w:w="2436" w:type="dxa"/>
           </w:tcPr>
           <w:p>
             <w:r>
@@ -2044,7 +1980,7 @@
         </w:tc>
         <w:tc>
           <w:tcPr>
-            <w:tcW w:type="dxa" w:w="2436"/>
+            <w:tcW w:w="2436" w:type="dxa"/>
           </w:tcPr>
           <w:p>
             <w:r>
@@ -2054,7 +1990,7 @@
         </w:tc>
         <w:tc>
           <w:tcPr>
-            <w:tcW w:type="dxa" w:w="2436"/>
+            <w:tcW w:w="2436" w:type="dxa"/>
           </w:tcPr>
           <w:p>
             <w:r>
@@ -2064,11 +2000,11 @@
         </w:tc>
         <w:tc>
           <w:tcPr>
-            <w:tcW w:type="dxa" w:w="2436"/>
-          </w:tcPr>
-          <w:p>
-            <w:r>
-              <w:t>0.664</w:t>
+            <w:tcW w:w="2436" w:type="dxa"/>
+          </w:tcPr>
+          <w:p>
+            <w:r>
+              <w:t>0.687</w:t>
             </w:r>
           </w:p>
         </w:tc>
@@ -2076,7 +2012,7 @@
       <w:tr>
         <w:tc>
           <w:tcPr>
-            <w:tcW w:type="dxa" w:w="2436"/>
+            <w:tcW w:w="2436" w:type="dxa"/>
           </w:tcPr>
           <w:p>
             <w:r>
@@ -2086,7 +2022,7 @@
         </w:tc>
         <w:tc>
           <w:tcPr>
-            <w:tcW w:type="dxa" w:w="2436"/>
+            <w:tcW w:w="2436" w:type="dxa"/>
           </w:tcPr>
           <w:p>
             <w:r>
@@ -2096,7 +2032,7 @@
         </w:tc>
         <w:tc>
           <w:tcPr>
-            <w:tcW w:type="dxa" w:w="2436"/>
+            <w:tcW w:w="2436" w:type="dxa"/>
           </w:tcPr>
           <w:p>
             <w:r>
@@ -2106,7 +2042,7 @@
         </w:tc>
         <w:tc>
           <w:tcPr>
-            <w:tcW w:type="dxa" w:w="2436"/>
+            <w:tcW w:w="2436" w:type="dxa"/>
           </w:tcPr>
           <w:p>
             <w:r>
@@ -2118,12 +2054,12 @@
     </w:tbl>
     <w:p>
       <w:r>
-        <w:t>The partition is robust: Louvain, Greedy Modularity and Girvan–Newman agree closely, and FluidC is not far behind despite its fixed k. Louvain (16 non-trivial communities, modularity 0.737) is used as the primary partition. Of these, only one community is professional-majority: an industry-focused cluster of 109 nodes (147 professional vs. 116 general posts) centered on MTPE rates, working conditions and translation-industry news, with a visible Spanish-language contingent. The remaining large communities are general-dominated and organized by topic and fandom rather than by profession: game localization and store translations, DeepL/ChatGPT use in game development, fan translation, and developer/localization tooling. Only 1,566 of 3,864 posts (≈40%) fall inside non-trivial communities — the rest belong to authors outside the LCC or in tiny fragments — so this characterization describes the connected core of the discourse.</w:t>
-      </w:r>
-    </w:p>
-    <w:p>
-      <w:r>
-        <w:t>The answer to RQ4 is therefore asymmetric: professional translators concentrate in one cohesive community, while general users do not form a single opposing bloc — they scatter across many consumer/fandom pockets in which MT is discussed in the context of specific products. The MT debate on Bluesky is less “professionals vs. the public” and more “one professional hub surrounded by many independent fan and consumer conversations”, with a mixed set of professional and general accounts bridging the two (Figure 3).</w:t>
+        <w:t>The partition is robust in quality but not in exact numbers: Louvain, Greedy Modularity and Girvan–Newman agree closely, and FluidC is not far behind despite its fixed k. Louvain and FluidC are not exactly reproducible run-to-run in this environment, even with a fixed seed — re-running the identical code can shift the community count by about ±1 and the modularity by about ±0.01. Louvain (16 non-trivial communities, modularity 0.728, this run) is used as the primary partition. Of these, two communities are professional-majority in this run rather than a single one: an industry-focused cluster of 98 nodes (134 professional vs. 112 general posts) centered on MTPE rates, working conditions and translation-industry news, with a visible Spanish-language contingent, plus a smaller, more heterogeneous cluster of 57 nodes leaning professional by a narrower margin (57 vs. 49 general posts). The remaining large communities are general-dominated and organized by topic and fandom rather than by profession: game localization and store translations, DeepL/ChatGPT use in game development, fan translation, and developer/localization tooling. Only 1,566 of 3,864 posts (≈40%) fall inside non-trivial communities — the rest belong to authors outside the LCC or in tiny fragments — so this characterization describes the connected core of the discourse.</w:t>
+      </w:r>
+    </w:p>
+    <w:p>
+      <w:r>
+        <w:t>The answer to RQ4 is therefore asymmetric but more qualified than a single hub: professional translators concentrate in a small number of communities (two of the five largest in this run) rather than one, while general users do not form a single opposing bloc — they scatter across many consumer/fandom pockets in which MT is discussed in the context of specific products. The MT debate on Bluesky is less “professionals vs. the public” and more “a small set of professional-leaning hubs surrounded by many independent fan and consumer conversations”, with a mixed set of professional and general accounts bridging the two (Figure 3). Exactly how many professional hubs there are is not a stable number across runs.</w:t>
       </w:r>
     </w:p>
     <w:p>
@@ -2131,22 +2067,27 @@
         <w:jc w:val="center"/>
       </w:pPr>
       <w:r>
+        <w:rPr>
+          <w:noProof/>
+        </w:rPr>
+        <w:lastRenderedPageBreak/>
         <w:drawing>
-          <wp:inline xmlns:a="http://schemas.openxmlformats.org/drawingml/2006/main" xmlns:pic="http://schemas.openxmlformats.org/drawingml/2006/picture">
+          <wp:inline distT="0" distB="0" distL="0" distR="0" wp14:anchorId="2DE9F8AC" wp14:editId="03F598DC">
             <wp:extent cx="4023360" cy="3085616"/>
+            <wp:effectExtent l="0" t="0" r="0" b="0"/>
             <wp:docPr id="1865554331" name="Picture 1865554331"/>
             <wp:cNvGraphicFramePr>
-              <a:graphicFrameLocks noChangeAspect="1"/>
+              <a:graphicFrameLocks xmlns:a="http://schemas.openxmlformats.org/drawingml/2006/main" noChangeAspect="1"/>
             </wp:cNvGraphicFramePr>
-            <a:graphic>
+            <a:graphic xmlns:a="http://schemas.openxmlformats.org/drawingml/2006/main">
               <a:graphicData uri="http://schemas.openxmlformats.org/drawingml/2006/picture">
-                <pic:pic>
+                <pic:pic xmlns:pic="http://schemas.openxmlformats.org/drawingml/2006/picture">
                   <pic:nvPicPr>
                     <pic:cNvPr id="0" name="communities_test.png"/>
                     <pic:cNvPicPr/>
                   </pic:nvPicPr>
                   <pic:blipFill>
-                    <a:blip r:embed="rId19"/>
+                    <a:blip r:embed="rId7"/>
                     <a:stretch>
                       <a:fillRect/>
                     </a:stretch>
@@ -2156,7 +2097,9 @@
                       <a:off x="0" y="0"/>
                       <a:ext cx="4023360" cy="3085616"/>
                     </a:xfrm>
-                    <a:prstGeom prst="rect"/>
+                    <a:prstGeom prst="rect">
+                      <a:avLst/>
+                    </a:prstGeom>
                   </pic:spPr>
                 </pic:pic>
               </a:graphicData>
@@ -2230,7 +2173,7 @@
                     </pic:cNvPicPr>
                   </pic:nvPicPr>
                   <pic:blipFill>
-                    <a:blip r:embed="rId5"/>
+                    <a:blip r:embed="rId8"/>
                     <a:srcRect/>
                     <a:stretch>
                       <a:fillRect/>
@@ -2304,7 +2247,7 @@
                     </pic:cNvPicPr>
                   </pic:nvPicPr>
                   <pic:blipFill>
-                    <a:blip r:embed="rId6"/>
+                    <a:blip r:embed="rId9"/>
                     <a:srcRect/>
                     <a:stretch>
                       <a:fillRect/>
@@ -2366,12 +2309,6 @@
         <w:gridCol w:w="1600"/>
       </w:tblGrid>
       <w:tr>
-        <w:tblPrEx>
-          <w:tblCellMar>
-            <w:top w:w="0" w:type="dxa"/>
-            <w:bottom w:w="0" w:type="dxa"/>
-          </w:tblCellMar>
-        </w:tblPrEx>
         <w:tc>
           <w:tcPr>
             <w:tcW w:w="2800" w:type="dxa"/>
@@ -2438,12 +2375,6 @@
         </w:tc>
       </w:tr>
       <w:tr>
-        <w:tblPrEx>
-          <w:tblCellMar>
-            <w:top w:w="0" w:type="dxa"/>
-            <w:bottom w:w="0" w:type="dxa"/>
-          </w:tblCellMar>
-        </w:tblPrEx>
         <w:tc>
           <w:tcPr>
             <w:tcW w:w="2800" w:type="dxa"/>
@@ -2498,12 +2429,6 @@
         </w:tc>
       </w:tr>
       <w:tr>
-        <w:tblPrEx>
-          <w:tblCellMar>
-            <w:top w:w="0" w:type="dxa"/>
-            <w:bottom w:w="0" w:type="dxa"/>
-          </w:tblCellMar>
-        </w:tblPrEx>
         <w:tc>
           <w:tcPr>
             <w:tcW w:w="2800" w:type="dxa"/>
@@ -2558,12 +2483,6 @@
         </w:tc>
       </w:tr>
       <w:tr>
-        <w:tblPrEx>
-          <w:tblCellMar>
-            <w:top w:w="0" w:type="dxa"/>
-            <w:bottom w:w="0" w:type="dxa"/>
-          </w:tblCellMar>
-        </w:tblPrEx>
         <w:tc>
           <w:tcPr>
             <w:tcW w:w="2800" w:type="dxa"/>
@@ -2618,12 +2537,6 @@
         </w:tc>
       </w:tr>
       <w:tr>
-        <w:tblPrEx>
-          <w:tblCellMar>
-            <w:top w:w="0" w:type="dxa"/>
-            <w:bottom w:w="0" w:type="dxa"/>
-          </w:tblCellMar>
-        </w:tblPrEx>
         <w:tc>
           <w:tcPr>
             <w:tcW w:w="2800" w:type="dxa"/>
@@ -2718,7 +2631,7 @@
                     </pic:cNvPicPr>
                   </pic:nvPicPr>
                   <pic:blipFill>
-                    <a:blip r:embed="rId7"/>
+                    <a:blip r:embed="rId10"/>
                     <a:srcRect/>
                     <a:stretch>
                       <a:fillRect/>
@@ -2800,7 +2713,7 @@
                     </pic:cNvPicPr>
                   </pic:nvPicPr>
                   <pic:blipFill>
-                    <a:blip r:embed="rId8"/>
+                    <a:blip r:embed="rId11"/>
                     <a:srcRect/>
                     <a:stretch>
                       <a:fillRect/>
@@ -2869,246 +2782,6 @@
             <wp:extent cx="3619500" cy="1981200"/>
             <wp:effectExtent l="0" t="0" r="0" b="0"/>
             <wp:docPr id="972520174" name="Picture 972520174"/>
-            <wp:cNvGraphicFramePr>
-              <a:graphicFrameLocks xmlns:a="http://schemas.openxmlformats.org/drawingml/2006/main" noChangeAspect="1"/>
-            </wp:cNvGraphicFramePr>
-            <a:graphic xmlns:a="http://schemas.openxmlformats.org/drawingml/2006/main">
-              <a:graphicData uri="http://schemas.openxmlformats.org/drawingml/2006/picture">
-                <pic:pic xmlns:pic="http://schemas.openxmlformats.org/drawingml/2006/picture">
-                  <pic:nvPicPr>
-                    <pic:cNvPr id="0" name=""/>
-                    <pic:cNvPicPr>
-                      <a:picLocks noChangeAspect="1" noChangeArrowheads="1"/>
-                    </pic:cNvPicPr>
-                  </pic:nvPicPr>
-                  <pic:blipFill>
-                    <a:blip r:embed="rId9"/>
-                    <a:srcRect/>
-                    <a:stretch>
-                      <a:fillRect/>
-                    </a:stretch>
-                  </pic:blipFill>
-                  <pic:spPr bwMode="auto">
-                    <a:xfrm>
-                      <a:off x="0" y="0"/>
-                      <a:ext cx="3619500" cy="1981200"/>
-                    </a:xfrm>
-                    <a:prstGeom prst="rect">
-                      <a:avLst/>
-                    </a:prstGeom>
-                  </pic:spPr>
-                </pic:pic>
-              </a:graphicData>
-            </a:graphic>
-          </wp:inline>
-        </w:drawing>
-      </w:r>
-    </w:p>
-    <w:p>
-      <w:pPr>
-        <w:spacing w:after="160"/>
-        <w:jc w:val="center"/>
-      </w:pPr>
-      <w:r>
-        <w:rPr>
-          <w:i/>
-          <w:iCs/>
-          <w:color w:val="555555"/>
-          <w:sz w:val="19"/>
-          <w:szCs w:val="19"/>
-        </w:rPr>
-        <w:t>Figure 8 — Overall NRCLex emotion profile (mean affect frequency).</w:t>
-      </w:r>
-    </w:p>
-    <w:p>
-      <w:pPr>
-        <w:spacing w:after="100"/>
-      </w:pPr>
-      <w:r>
-        <w:t>Differences between user types are small relative to the tool-to-tool differences below — which emotion detector is used matters more here than which audience is examined:</w:t>
-      </w:r>
-    </w:p>
-    <w:p>
-      <w:pPr>
-        <w:spacing w:before="100" w:after="60"/>
-        <w:jc w:val="center"/>
-      </w:pPr>
-      <w:r>
-        <w:rPr>
-          <w:noProof/>
-        </w:rPr>
-        <w:drawing>
-          <wp:inline distT="0" distB="0" distL="0" distR="0" wp14:anchorId="45884FC9" wp14:editId="1969A3FE">
-            <wp:extent cx="3619500" cy="3028950"/>
-            <wp:effectExtent l="0" t="0" r="0" b="0"/>
-            <wp:docPr id="1597819871" name="Picture 1597819871"/>
-            <wp:cNvGraphicFramePr>
-              <a:graphicFrameLocks xmlns:a="http://schemas.openxmlformats.org/drawingml/2006/main" noChangeAspect="1"/>
-            </wp:cNvGraphicFramePr>
-            <a:graphic xmlns:a="http://schemas.openxmlformats.org/drawingml/2006/main">
-              <a:graphicData uri="http://schemas.openxmlformats.org/drawingml/2006/picture">
-                <pic:pic xmlns:pic="http://schemas.openxmlformats.org/drawingml/2006/picture">
-                  <pic:nvPicPr>
-                    <pic:cNvPr id="0" name=""/>
-                    <pic:cNvPicPr>
-                      <a:picLocks noChangeAspect="1" noChangeArrowheads="1"/>
-                    </pic:cNvPicPr>
-                  </pic:nvPicPr>
-                  <pic:blipFill>
-                    <a:blip r:embed="rId10"/>
-                    <a:srcRect/>
-                    <a:stretch>
-                      <a:fillRect/>
-                    </a:stretch>
-                  </pic:blipFill>
-                  <pic:spPr bwMode="auto">
-                    <a:xfrm>
-                      <a:off x="0" y="0"/>
-                      <a:ext cx="3619500" cy="3028950"/>
-                    </a:xfrm>
-                    <a:prstGeom prst="rect">
-                      <a:avLst/>
-                    </a:prstGeom>
-                  </pic:spPr>
-                </pic:pic>
-              </a:graphicData>
-            </a:graphic>
-          </wp:inline>
-        </w:drawing>
-      </w:r>
-    </w:p>
-    <w:p>
-      <w:pPr>
-        <w:spacing w:after="160"/>
-        <w:jc w:val="center"/>
-      </w:pPr>
-      <w:r>
-        <w:rPr>
-          <w:i/>
-          <w:iCs/>
-          <w:color w:val="555555"/>
-          <w:sz w:val="19"/>
-          <w:szCs w:val="19"/>
-        </w:rPr>
-        <w:t>Figure 9 — NRCLex emotion profile by user type.</w:t>
-      </w:r>
-    </w:p>
-    <w:p>
-      <w:pPr>
-        <w:spacing w:after="100"/>
-      </w:pPr>
-      <w:r>
-        <w:t xml:space="preserve">NRCLex's per-post dominant emotion is trust (49.0%) or fear (31.8%) for the large majority of posts. Conditioning on posts where DistilRoBERTa is confident enough to name a specific non-neutral emotion </w:t>
-      </w:r>
-      <w:r>
-        <w:lastRenderedPageBreak/>
-        <w:t>(44.5% of posts) barely changes this — NRCLex still calls trust 46.5% and fear 30.3% of the time there, and the two tools agree on only 15.6% of posts:</w:t>
-      </w:r>
-    </w:p>
-    <w:p>
-      <w:pPr>
-        <w:spacing w:before="100" w:after="60"/>
-        <w:jc w:val="center"/>
-      </w:pPr>
-      <w:r>
-        <w:rPr>
-          <w:noProof/>
-        </w:rPr>
-        <w:drawing>
-          <wp:inline distT="0" distB="0" distL="0" distR="0" wp14:anchorId="04C5162D" wp14:editId="17F07A17">
-            <wp:extent cx="4381500" cy="1657350"/>
-            <wp:effectExtent l="0" t="0" r="0" b="0"/>
-            <wp:docPr id="622128366" name="Picture 622128366"/>
-            <wp:cNvGraphicFramePr>
-              <a:graphicFrameLocks xmlns:a="http://schemas.openxmlformats.org/drawingml/2006/main" noChangeAspect="1"/>
-            </wp:cNvGraphicFramePr>
-            <a:graphic xmlns:a="http://schemas.openxmlformats.org/drawingml/2006/main">
-              <a:graphicData uri="http://schemas.openxmlformats.org/drawingml/2006/picture">
-                <pic:pic xmlns:pic="http://schemas.openxmlformats.org/drawingml/2006/picture">
-                  <pic:nvPicPr>
-                    <pic:cNvPr id="0" name=""/>
-                    <pic:cNvPicPr>
-                      <a:picLocks noChangeAspect="1" noChangeArrowheads="1"/>
-                    </pic:cNvPicPr>
-                  </pic:nvPicPr>
-                  <pic:blipFill>
-                    <a:blip r:embed="rId11"/>
-                    <a:srcRect/>
-                    <a:stretch>
-                      <a:fillRect/>
-                    </a:stretch>
-                  </pic:blipFill>
-                  <pic:spPr bwMode="auto">
-                    <a:xfrm>
-                      <a:off x="0" y="0"/>
-                      <a:ext cx="4381500" cy="1657350"/>
-                    </a:xfrm>
-                    <a:prstGeom prst="rect">
-                      <a:avLst/>
-                    </a:prstGeom>
-                  </pic:spPr>
-                </pic:pic>
-              </a:graphicData>
-            </a:graphic>
-          </wp:inline>
-        </w:drawing>
-      </w:r>
-    </w:p>
-    <w:p>
-      <w:pPr>
-        <w:spacing w:after="160"/>
-        <w:jc w:val="center"/>
-      </w:pPr>
-      <w:r>
-        <w:rPr>
-          <w:i/>
-          <w:iCs/>
-          <w:color w:val="555555"/>
-          <w:sz w:val="19"/>
-          <w:szCs w:val="19"/>
-        </w:rPr>
-        <w:t>Figure 10 — NRCLex vs. DistilRoBERTa dominant-emotion distributions (each on its own full label set).</w:t>
-      </w:r>
-    </w:p>
-    <w:p>
-      <w:pPr>
-        <w:spacing w:after="100"/>
-      </w:pPr>
-      <w:r>
-        <w:t>NRCLex's dominant-emotion output is close to invariant to what a post actually says — consistent with “trust” being an oversized NRC lexicon category that fires on ordinary vocabulary. This report therefore treats the sentiment comparison (RQ1) as the more reliable evidence for framing, and emotion as exploratory/secondary.</w:t>
-      </w:r>
-    </w:p>
-    <w:p>
-      <w:pPr>
-        <w:pStyle w:val="Heading3"/>
-        <w:spacing w:before="140" w:after="80"/>
-      </w:pPr>
-      <w:r>
-        <w:t>4.2.3 Named Entity Recognition</w:t>
-      </w:r>
-    </w:p>
-    <w:p>
-      <w:pPr>
-        <w:spacing w:after="100"/>
-      </w:pPr>
-      <w:r>
-        <w:t>spaCy extracted 5,523 entities (ORG 2,568, PERSON 1,840, GPE 979, PRODUCT 136). Several top "entities" below (MTPE, LLM, MTL, MT, NMT, CAT, UI, NLP, L10N, QA) are domain acronyms mis-tagged as organizations by the generic model, reported as-is rather than filtered out:</w:t>
-      </w:r>
-    </w:p>
-    <w:p>
-      <w:pPr>
-        <w:spacing w:before="100" w:after="60"/>
-        <w:jc w:val="center"/>
-      </w:pPr>
-      <w:r>
-        <w:rPr>
-          <w:noProof/>
-        </w:rPr>
-        <w:drawing>
-          <wp:inline distT="0" distB="0" distL="0" distR="0" wp14:anchorId="7F88919A" wp14:editId="3546CB90">
-            <wp:extent cx="3619500" cy="2390775"/>
-            <wp:effectExtent l="0" t="0" r="0" b="0"/>
-            <wp:docPr id="288101758" name="Picture 288101758"/>
             <wp:cNvGraphicFramePr>
               <a:graphicFrameLocks xmlns:a="http://schemas.openxmlformats.org/drawingml/2006/main" noChangeAspect="1"/>
             </wp:cNvGraphicFramePr>
@@ -3131,6 +2804,246 @@
                   <pic:spPr bwMode="auto">
                     <a:xfrm>
                       <a:off x="0" y="0"/>
+                      <a:ext cx="3619500" cy="1981200"/>
+                    </a:xfrm>
+                    <a:prstGeom prst="rect">
+                      <a:avLst/>
+                    </a:prstGeom>
+                  </pic:spPr>
+                </pic:pic>
+              </a:graphicData>
+            </a:graphic>
+          </wp:inline>
+        </w:drawing>
+      </w:r>
+    </w:p>
+    <w:p>
+      <w:pPr>
+        <w:spacing w:after="160"/>
+        <w:jc w:val="center"/>
+      </w:pPr>
+      <w:r>
+        <w:rPr>
+          <w:i/>
+          <w:iCs/>
+          <w:color w:val="555555"/>
+          <w:sz w:val="19"/>
+          <w:szCs w:val="19"/>
+        </w:rPr>
+        <w:t>Figure 8 — Overall NRCLex emotion profile (mean affect frequency).</w:t>
+      </w:r>
+    </w:p>
+    <w:p>
+      <w:pPr>
+        <w:spacing w:after="100"/>
+      </w:pPr>
+      <w:r>
+        <w:t>Differences between user types are small relative to the tool-to-tool differences below — which emotion detector is used matters more here than which audience is examined:</w:t>
+      </w:r>
+    </w:p>
+    <w:p>
+      <w:pPr>
+        <w:spacing w:before="100" w:after="60"/>
+        <w:jc w:val="center"/>
+      </w:pPr>
+      <w:r>
+        <w:rPr>
+          <w:noProof/>
+        </w:rPr>
+        <w:drawing>
+          <wp:inline distT="0" distB="0" distL="0" distR="0" wp14:anchorId="45884FC9" wp14:editId="1969A3FE">
+            <wp:extent cx="3619500" cy="3028950"/>
+            <wp:effectExtent l="0" t="0" r="0" b="0"/>
+            <wp:docPr id="1597819871" name="Picture 1597819871"/>
+            <wp:cNvGraphicFramePr>
+              <a:graphicFrameLocks xmlns:a="http://schemas.openxmlformats.org/drawingml/2006/main" noChangeAspect="1"/>
+            </wp:cNvGraphicFramePr>
+            <a:graphic xmlns:a="http://schemas.openxmlformats.org/drawingml/2006/main">
+              <a:graphicData uri="http://schemas.openxmlformats.org/drawingml/2006/picture">
+                <pic:pic xmlns:pic="http://schemas.openxmlformats.org/drawingml/2006/picture">
+                  <pic:nvPicPr>
+                    <pic:cNvPr id="0" name=""/>
+                    <pic:cNvPicPr>
+                      <a:picLocks noChangeAspect="1" noChangeArrowheads="1"/>
+                    </pic:cNvPicPr>
+                  </pic:nvPicPr>
+                  <pic:blipFill>
+                    <a:blip r:embed="rId13"/>
+                    <a:srcRect/>
+                    <a:stretch>
+                      <a:fillRect/>
+                    </a:stretch>
+                  </pic:blipFill>
+                  <pic:spPr bwMode="auto">
+                    <a:xfrm>
+                      <a:off x="0" y="0"/>
+                      <a:ext cx="3619500" cy="3028950"/>
+                    </a:xfrm>
+                    <a:prstGeom prst="rect">
+                      <a:avLst/>
+                    </a:prstGeom>
+                  </pic:spPr>
+                </pic:pic>
+              </a:graphicData>
+            </a:graphic>
+          </wp:inline>
+        </w:drawing>
+      </w:r>
+    </w:p>
+    <w:p>
+      <w:pPr>
+        <w:spacing w:after="160"/>
+        <w:jc w:val="center"/>
+      </w:pPr>
+      <w:r>
+        <w:rPr>
+          <w:i/>
+          <w:iCs/>
+          <w:color w:val="555555"/>
+          <w:sz w:val="19"/>
+          <w:szCs w:val="19"/>
+        </w:rPr>
+        <w:t>Figure 9 — NRCLex emotion profile by user type.</w:t>
+      </w:r>
+    </w:p>
+    <w:p>
+      <w:pPr>
+        <w:spacing w:after="100"/>
+      </w:pPr>
+      <w:r>
+        <w:t xml:space="preserve">NRCLex's per-post dominant emotion is trust (49.0%) or fear (31.8%) for the large majority of posts. Conditioning on posts where DistilRoBERTa is confident enough to name a specific non-neutral emotion </w:t>
+      </w:r>
+      <w:r>
+        <w:lastRenderedPageBreak/>
+        <w:t>(44.5% of posts) barely changes this — NRCLex still calls trust 46.5% and fear 30.3% of the time there, and the two tools agree on only 15.6% of posts:</w:t>
+      </w:r>
+    </w:p>
+    <w:p>
+      <w:pPr>
+        <w:spacing w:before="100" w:after="60"/>
+        <w:jc w:val="center"/>
+      </w:pPr>
+      <w:r>
+        <w:rPr>
+          <w:noProof/>
+        </w:rPr>
+        <w:drawing>
+          <wp:inline distT="0" distB="0" distL="0" distR="0" wp14:anchorId="04C5162D" wp14:editId="17F07A17">
+            <wp:extent cx="4381500" cy="1657350"/>
+            <wp:effectExtent l="0" t="0" r="0" b="0"/>
+            <wp:docPr id="622128366" name="Picture 622128366"/>
+            <wp:cNvGraphicFramePr>
+              <a:graphicFrameLocks xmlns:a="http://schemas.openxmlformats.org/drawingml/2006/main" noChangeAspect="1"/>
+            </wp:cNvGraphicFramePr>
+            <a:graphic xmlns:a="http://schemas.openxmlformats.org/drawingml/2006/main">
+              <a:graphicData uri="http://schemas.openxmlformats.org/drawingml/2006/picture">
+                <pic:pic xmlns:pic="http://schemas.openxmlformats.org/drawingml/2006/picture">
+                  <pic:nvPicPr>
+                    <pic:cNvPr id="0" name=""/>
+                    <pic:cNvPicPr>
+                      <a:picLocks noChangeAspect="1" noChangeArrowheads="1"/>
+                    </pic:cNvPicPr>
+                  </pic:nvPicPr>
+                  <pic:blipFill>
+                    <a:blip r:embed="rId14"/>
+                    <a:srcRect/>
+                    <a:stretch>
+                      <a:fillRect/>
+                    </a:stretch>
+                  </pic:blipFill>
+                  <pic:spPr bwMode="auto">
+                    <a:xfrm>
+                      <a:off x="0" y="0"/>
+                      <a:ext cx="4381500" cy="1657350"/>
+                    </a:xfrm>
+                    <a:prstGeom prst="rect">
+                      <a:avLst/>
+                    </a:prstGeom>
+                  </pic:spPr>
+                </pic:pic>
+              </a:graphicData>
+            </a:graphic>
+          </wp:inline>
+        </w:drawing>
+      </w:r>
+    </w:p>
+    <w:p>
+      <w:pPr>
+        <w:spacing w:after="160"/>
+        <w:jc w:val="center"/>
+      </w:pPr>
+      <w:r>
+        <w:rPr>
+          <w:i/>
+          <w:iCs/>
+          <w:color w:val="555555"/>
+          <w:sz w:val="19"/>
+          <w:szCs w:val="19"/>
+        </w:rPr>
+        <w:t>Figure 10 — NRCLex vs. DistilRoBERTa dominant-emotion distributions (each on its own full label set).</w:t>
+      </w:r>
+    </w:p>
+    <w:p>
+      <w:pPr>
+        <w:spacing w:after="100"/>
+      </w:pPr>
+      <w:r>
+        <w:t>NRCLex's dominant-emotion output is close to invariant to what a post actually says — consistent with “trust” being an oversized NRC lexicon category that fires on ordinary vocabulary. This report therefore treats the sentiment comparison (RQ1) as the more reliable evidence for framing, and emotion as exploratory/secondary.</w:t>
+      </w:r>
+    </w:p>
+    <w:p>
+      <w:pPr>
+        <w:pStyle w:val="Heading3"/>
+        <w:spacing w:before="140" w:after="80"/>
+      </w:pPr>
+      <w:r>
+        <w:t>4.2.3 Named Entity Recognition</w:t>
+      </w:r>
+    </w:p>
+    <w:p>
+      <w:pPr>
+        <w:spacing w:after="100"/>
+      </w:pPr>
+      <w:r>
+        <w:t>spaCy extracted 5,523 entities (ORG 2,568, PERSON 1,840, GPE 979, PRODUCT 136). Several top "entities" below (MTPE, LLM, MTL, MT, NMT, CAT, UI, NLP, L10N, QA) are domain acronyms mis-tagged as organizations by the generic model, reported as-is rather than filtered out:</w:t>
+      </w:r>
+    </w:p>
+    <w:p>
+      <w:pPr>
+        <w:spacing w:before="100" w:after="60"/>
+        <w:jc w:val="center"/>
+      </w:pPr>
+      <w:r>
+        <w:rPr>
+          <w:noProof/>
+        </w:rPr>
+        <w:drawing>
+          <wp:inline distT="0" distB="0" distL="0" distR="0" wp14:anchorId="7F88919A" wp14:editId="3546CB90">
+            <wp:extent cx="3619500" cy="2390775"/>
+            <wp:effectExtent l="0" t="0" r="0" b="0"/>
+            <wp:docPr id="288101758" name="Picture 288101758"/>
+            <wp:cNvGraphicFramePr>
+              <a:graphicFrameLocks xmlns:a="http://schemas.openxmlformats.org/drawingml/2006/main" noChangeAspect="1"/>
+            </wp:cNvGraphicFramePr>
+            <a:graphic xmlns:a="http://schemas.openxmlformats.org/drawingml/2006/main">
+              <a:graphicData uri="http://schemas.openxmlformats.org/drawingml/2006/picture">
+                <pic:pic xmlns:pic="http://schemas.openxmlformats.org/drawingml/2006/picture">
+                  <pic:nvPicPr>
+                    <pic:cNvPr id="0" name=""/>
+                    <pic:cNvPicPr>
+                      <a:picLocks noChangeAspect="1" noChangeArrowheads="1"/>
+                    </pic:cNvPicPr>
+                  </pic:nvPicPr>
+                  <pic:blipFill>
+                    <a:blip r:embed="rId15"/>
+                    <a:srcRect/>
+                    <a:stretch>
+                      <a:fillRect/>
+                    </a:stretch>
+                  </pic:blipFill>
+                  <pic:spPr bwMode="auto">
+                    <a:xfrm>
+                      <a:off x="0" y="0"/>
                       <a:ext cx="3619500" cy="2390775"/>
                     </a:xfrm>
                     <a:prstGeom prst="rect">
@@ -3196,7 +3109,7 @@
                     </pic:cNvPicPr>
                   </pic:nvPicPr>
                   <pic:blipFill>
-                    <a:blip r:embed="rId13"/>
+                    <a:blip r:embed="rId16"/>
                     <a:srcRect/>
                     <a:stretch>
                       <a:fillRect/>
@@ -3259,12 +3172,6 @@
         <w:gridCol w:w="1600"/>
       </w:tblGrid>
       <w:tr>
-        <w:tblPrEx>
-          <w:tblCellMar>
-            <w:top w:w="0" w:type="dxa"/>
-            <w:bottom w:w="0" w:type="dxa"/>
-          </w:tblCellMar>
-        </w:tblPrEx>
         <w:tc>
           <w:tcPr>
             <w:tcW w:w="3200" w:type="dxa"/>
@@ -3347,12 +3254,6 @@
         </w:tc>
       </w:tr>
       <w:tr>
-        <w:tblPrEx>
-          <w:tblCellMar>
-            <w:top w:w="0" w:type="dxa"/>
-            <w:bottom w:w="0" w:type="dxa"/>
-          </w:tblCellMar>
-        </w:tblPrEx>
         <w:tc>
           <w:tcPr>
             <w:tcW w:w="3200" w:type="dxa"/>
@@ -3420,12 +3321,6 @@
         </w:tc>
       </w:tr>
       <w:tr>
-        <w:tblPrEx>
-          <w:tblCellMar>
-            <w:top w:w="0" w:type="dxa"/>
-            <w:bottom w:w="0" w:type="dxa"/>
-          </w:tblCellMar>
-        </w:tblPrEx>
         <w:tc>
           <w:tcPr>
             <w:tcW w:w="3200" w:type="dxa"/>
@@ -3493,12 +3388,6 @@
         </w:tc>
       </w:tr>
       <w:tr>
-        <w:tblPrEx>
-          <w:tblCellMar>
-            <w:top w:w="0" w:type="dxa"/>
-            <w:bottom w:w="0" w:type="dxa"/>
-          </w:tblCellMar>
-        </w:tblPrEx>
         <w:tc>
           <w:tcPr>
             <w:tcW w:w="3200" w:type="dxa"/>
@@ -3566,12 +3455,6 @@
         </w:tc>
       </w:tr>
       <w:tr>
-        <w:tblPrEx>
-          <w:tblCellMar>
-            <w:top w:w="0" w:type="dxa"/>
-            <w:bottom w:w="0" w:type="dxa"/>
-          </w:tblCellMar>
-        </w:tblPrEx>
         <w:tc>
           <w:tcPr>
             <w:tcW w:w="3200" w:type="dxa"/>
@@ -3639,12 +3522,6 @@
         </w:tc>
       </w:tr>
       <w:tr>
-        <w:tblPrEx>
-          <w:tblCellMar>
-            <w:top w:w="0" w:type="dxa"/>
-            <w:bottom w:w="0" w:type="dxa"/>
-          </w:tblCellMar>
-        </w:tblPrEx>
         <w:tc>
           <w:tcPr>
             <w:tcW w:w="3200" w:type="dxa"/>
@@ -3712,12 +3589,6 @@
         </w:tc>
       </w:tr>
       <w:tr>
-        <w:tblPrEx>
-          <w:tblCellMar>
-            <w:top w:w="0" w:type="dxa"/>
-            <w:bottom w:w="0" w:type="dxa"/>
-          </w:tblCellMar>
-        </w:tblPrEx>
         <w:tc>
           <w:tcPr>
             <w:tcW w:w="3200" w:type="dxa"/>
@@ -3785,12 +3656,6 @@
         </w:tc>
       </w:tr>
       <w:tr>
-        <w:tblPrEx>
-          <w:tblCellMar>
-            <w:top w:w="0" w:type="dxa"/>
-            <w:bottom w:w="0" w:type="dxa"/>
-          </w:tblCellMar>
-        </w:tblPrEx>
         <w:tc>
           <w:tcPr>
             <w:tcW w:w="3200" w:type="dxa"/>
@@ -3858,12 +3723,6 @@
         </w:tc>
       </w:tr>
       <w:tr>
-        <w:tblPrEx>
-          <w:tblCellMar>
-            <w:top w:w="0" w:type="dxa"/>
-            <w:bottom w:w="0" w:type="dxa"/>
-          </w:tblCellMar>
-        </w:tblPrEx>
         <w:tc>
           <w:tcPr>
             <w:tcW w:w="3200" w:type="dxa"/>
@@ -3931,12 +3790,6 @@
         </w:tc>
       </w:tr>
       <w:tr>
-        <w:tblPrEx>
-          <w:tblCellMar>
-            <w:top w:w="0" w:type="dxa"/>
-            <w:bottom w:w="0" w:type="dxa"/>
-          </w:tblCellMar>
-        </w:tblPrEx>
         <w:tc>
           <w:tcPr>
             <w:tcW w:w="3200" w:type="dxa"/>
@@ -4004,12 +3857,6 @@
         </w:tc>
       </w:tr>
       <w:tr>
-        <w:tblPrEx>
-          <w:tblCellMar>
-            <w:top w:w="0" w:type="dxa"/>
-            <w:bottom w:w="0" w:type="dxa"/>
-          </w:tblCellMar>
-        </w:tblPrEx>
         <w:tc>
           <w:tcPr>
             <w:tcW w:w="3200" w:type="dxa"/>
@@ -4077,12 +3924,6 @@
         </w:tc>
       </w:tr>
       <w:tr>
-        <w:tblPrEx>
-          <w:tblCellMar>
-            <w:top w:w="0" w:type="dxa"/>
-            <w:bottom w:w="0" w:type="dxa"/>
-          </w:tblCellMar>
-        </w:tblPrEx>
         <w:tc>
           <w:tcPr>
             <w:tcW w:w="3200" w:type="dxa"/>
@@ -4150,12 +3991,6 @@
         </w:tc>
       </w:tr>
       <w:tr>
-        <w:tblPrEx>
-          <w:tblCellMar>
-            <w:top w:w="0" w:type="dxa"/>
-            <w:bottom w:w="0" w:type="dxa"/>
-          </w:tblCellMar>
-        </w:tblPrEx>
         <w:tc>
           <w:tcPr>
             <w:tcW w:w="3200" w:type="dxa"/>
@@ -4223,12 +4058,6 @@
         </w:tc>
       </w:tr>
       <w:tr>
-        <w:tblPrEx>
-          <w:tblCellMar>
-            <w:top w:w="0" w:type="dxa"/>
-            <w:bottom w:w="0" w:type="dxa"/>
-          </w:tblCellMar>
-        </w:tblPrEx>
         <w:tc>
           <w:tcPr>
             <w:tcW w:w="3200" w:type="dxa"/>
@@ -4345,7 +4174,7 @@
                     </pic:cNvPicPr>
                   </pic:nvPicPr>
                   <pic:blipFill>
-                    <a:blip r:embed="rId14"/>
+                    <a:blip r:embed="rId17"/>
                     <a:srcRect/>
                     <a:stretch>
                       <a:fillRect/>
@@ -4440,12 +4269,12 @@
     </w:p>
     <w:p>
       <w:r>
-        <w:t>The network results reframe the content-analysis findings: the MT debate on Bluesky is not a confrontation between two opposing camps. Professional translators form a single cohesive, highly-followed community — they dominate in-degree and closeness centrality and hold half of the top bridging positions — while general users scatter across many product- and fandom-centered pockets (game localization, fan translation, developer tooling) in which MT is discussed in the context of specific products. This matches the entity-level finding that DeepL and Google Translate dominate the conversation for every group: the discourse is organized around concrete tools and products, not around an abstract pro/anti divide.</w:t>
-      </w:r>
-    </w:p>
-    <w:p>
-      <w:r>
-        <w:t>Against this structure, the sentiment findings become more legible. Professionals — the most visible, most-followed group — are also the most positive on average, consistent with the tool-and-threat duality of RQ1–RQ3: the community most exposed to displacement discusses MT with the most nuance, acknowledging its utility while contesting working conditions (MTPE rates, credit, quality). Conversational attention, by contrast, is event-driven and centers on general accounts, as the single viral thread that dominates the reply network shows: public engagement with MT flares around specific incidents — a game shipping machine-translated text, an uncredited translation — rather than around the professional community’s ongoing debate. In short: a stable professional hub with sustained, nuanced discourse, surrounded by episodic consumer conversations triggered by product-level encounters with machine translation.</w:t>
+        <w:t>The network results reframe the content-analysis findings: the MT debate on Bluesky is not a confrontation between two opposing camps. Professional translators concentrate in a small number of cohesive, highly-followed communities rather than one — they dominate in-degree and closeness centrality and hold half of the top bridging positions — while general users scatter across many product- and fandom-centered pockets (game localization, fan translation, developer tooling) in which MT is discussed in the context of specific products. This matches the entity-level finding that DeepL and Google Translate dominate the conversation for every group: the discourse is organized around concrete tools and products, not around an abstract pro/anti divide.</w:t>
+      </w:r>
+    </w:p>
+    <w:p>
+      <w:r>
+        <w:t>Against this structure, the sentiment findings become more legible. Professionals — the most visible, most-followed group — are also the most positive on average, consistent with the tool-and-threat duality of RQ1–RQ3: the community most exposed to displacement discusses MT with the most nuance, acknowledging its utility while contesting working conditions (MTPE rates, credit, quality). Conversational attention, by contrast, is event-driven and centers on general accounts, as the single viral thread that dominates the reply network shows: public engagement with MT flares around specific incidents — a game shipping machine-translated text, an uncredited translation — rather than around the professional community’s ongoing debate. In short: a small set of stable professional hubs with sustained, nuanced discourse, surrounded by episodic consumer conversations triggered by product-level encounters with machine translation.</w:t>
       </w:r>
     </w:p>
     <w:p>
@@ -4546,6 +4375,20 @@
       </w:pPr>
       <w:r>
         <w:t>Nodes are identified by Bluesky handle, not the more stable DID (stored as a fallback only). Only public posts and follower lists were collected, at polite request rates, via the official API.</w:t>
+      </w:r>
+    </w:p>
+    <w:p>
+      <w:pPr>
+        <w:pStyle w:val="ListParagraph"/>
+        <w:numPr>
+          <w:ilvl w:val="0"/>
+          <w:numId w:val="1"/>
+        </w:numPr>
+        <w:spacing w:after="40"/>
+      </w:pPr>
+      <w:r>
+        <w:lastRenderedPageBreak/>
+        <w:t>Louvain and FluidC community detection are not exactly reproducible run-to-run in this environment: the exact community count, modularity, and even which communities are professional-majority can shift between runs of the identical seeded code, due to Python’s per-process hash randomization affecting Louvain’s greedy optimization order. Greedy Modularity and Girvan–Newman do not have this issue. Numbers reported in Section 4.1.3 are from one specific run.</w:t>
       </w:r>
     </w:p>
     <w:p>
@@ -4580,12 +4423,6 @@
         <w:gridCol w:w="2000"/>
       </w:tblGrid>
       <w:tr>
-        <w:tblPrEx>
-          <w:tblCellMar>
-            <w:top w:w="0" w:type="dxa"/>
-            <w:bottom w:w="0" w:type="dxa"/>
-          </w:tblCellMar>
-        </w:tblPrEx>
         <w:tc>
           <w:tcPr>
             <w:tcW w:w="3200" w:type="dxa"/>
@@ -4636,12 +4473,6 @@
         </w:tc>
       </w:tr>
       <w:tr>
-        <w:tblPrEx>
-          <w:tblCellMar>
-            <w:top w:w="0" w:type="dxa"/>
-            <w:bottom w:w="0" w:type="dxa"/>
-          </w:tblCellMar>
-        </w:tblPrEx>
         <w:tc>
           <w:tcPr>
             <w:tcW w:w="3200" w:type="dxa"/>
@@ -4683,12 +4514,6 @@
         </w:tc>
       </w:tr>
       <w:tr>
-        <w:tblPrEx>
-          <w:tblCellMar>
-            <w:top w:w="0" w:type="dxa"/>
-            <w:bottom w:w="0" w:type="dxa"/>
-          </w:tblCellMar>
-        </w:tblPrEx>
         <w:tc>
           <w:tcPr>
             <w:tcW w:w="3200" w:type="dxa"/>
@@ -4730,12 +4555,6 @@
         </w:tc>
       </w:tr>
       <w:tr>
-        <w:tblPrEx>
-          <w:tblCellMar>
-            <w:top w:w="0" w:type="dxa"/>
-            <w:bottom w:w="0" w:type="dxa"/>
-          </w:tblCellMar>
-        </w:tblPrEx>
         <w:tc>
           <w:tcPr>
             <w:tcW w:w="3200" w:type="dxa"/>
@@ -4777,12 +4596,6 @@
         </w:tc>
       </w:tr>
       <w:tr>
-        <w:tblPrEx>
-          <w:tblCellMar>
-            <w:top w:w="0" w:type="dxa"/>
-            <w:bottom w:w="0" w:type="dxa"/>
-          </w:tblCellMar>
-        </w:tblPrEx>
         <w:tc>
           <w:tcPr>
             <w:tcW w:w="3200" w:type="dxa"/>
@@ -4824,12 +4637,6 @@
         </w:tc>
       </w:tr>
       <w:tr>
-        <w:tblPrEx>
-          <w:tblCellMar>
-            <w:top w:w="0" w:type="dxa"/>
-            <w:bottom w:w="0" w:type="dxa"/>
-          </w:tblCellMar>
-        </w:tblPrEx>
         <w:tc>
           <w:tcPr>
             <w:tcW w:w="3200" w:type="dxa"/>
@@ -4871,12 +4678,6 @@
         </w:tc>
       </w:tr>
       <w:tr>
-        <w:tblPrEx>
-          <w:tblCellMar>
-            <w:top w:w="0" w:type="dxa"/>
-            <w:bottom w:w="0" w:type="dxa"/>
-          </w:tblCellMar>
-        </w:tblPrEx>
         <w:tc>
           <w:tcPr>
             <w:tcW w:w="3200" w:type="dxa"/>
@@ -4918,12 +4719,6 @@
         </w:tc>
       </w:tr>
       <w:tr>
-        <w:tblPrEx>
-          <w:tblCellMar>
-            <w:top w:w="0" w:type="dxa"/>
-            <w:bottom w:w="0" w:type="dxa"/>
-          </w:tblCellMar>
-        </w:tblPrEx>
         <w:tc>
           <w:tcPr>
             <w:tcW w:w="3200" w:type="dxa"/>
@@ -4965,12 +4760,6 @@
         </w:tc>
       </w:tr>
       <w:tr>
-        <w:tblPrEx>
-          <w:tblCellMar>
-            <w:top w:w="0" w:type="dxa"/>
-            <w:bottom w:w="0" w:type="dxa"/>
-          </w:tblCellMar>
-        </w:tblPrEx>
         <w:tc>
           <w:tcPr>
             <w:tcW w:w="3200" w:type="dxa"/>
@@ -5022,7 +4811,6 @@
         <w:spacing w:before="200"/>
       </w:pPr>
       <w:r>
-        <w:lastRenderedPageBreak/>
         <w:t>Full source code, data dictionary, and setup instructions are in the project README and in 01_data_collection.ipynb / 02_network_analysis.ipynb / 03_content_analysis.ipynb.</w:t>
       </w:r>
     </w:p>
@@ -5037,7 +4825,7 @@
 </file>
 
 <file path=word/numbering.xml><?xml version="1.0" encoding="utf-8"?>
-<w:numbering xmlns:wpc="http://schemas.microsoft.com/office/word/2010/wordprocessingCanvas" xmlns:cx="http://schemas.microsoft.com/office/drawing/2014/chartex" xmlns:cx1="http://schemas.microsoft.com/office/drawing/2015/9/8/chartex" xmlns:cx2="http://schemas.microsoft.com/office/drawing/2015/10/21/chartex" xmlns:cx3="http://schemas.microsoft.com/office/drawing/2016/5/9/chartex" xmlns:cx4="http://schemas.microsoft.com/office/drawing/2016/5/10/chartex" xmlns:cx5="http://schemas.microsoft.com/office/drawing/2016/5/11/chartex" xmlns:cx6="http://schemas.microsoft.com/office/drawing/2016/5/12/chartex" xmlns:cx7="http://schemas.microsoft.com/office/drawing/2016/5/13/chartex" xmlns:cx8="http://schemas.microsoft.com/office/drawing/2016/5/14/chartex" xmlns:mc="http://schemas.openxmlformats.org/markup-compatibility/2006" xmlns:aink="http://schemas.microsoft.com/office/drawing/2016/ink" xmlns:am3d="http://schemas.microsoft.com/office/drawing/2017/model3d" xmlns:o="urn:schemas-microsoft-com:office:office" xmlns:oel="http://schemas.microsoft.com/office/2019/extlst" xmlns:r="http://schemas.openxmlformats.org/officeDocument/2006/relationships" xmlns:m="http://schemas.openxmlformats.org/officeDocument/2006/math" xmlns:v="urn:schemas-microsoft-com:vml" xmlns:wp14="http://schemas.microsoft.com/office/word/2010/wordprocessingDrawing" xmlns:wp="http://schemas.openxmlformats.org/drawingml/2006/wordprocessingDrawing" xmlns:w10="urn:schemas-microsoft-com:office:word" xmlns:w="http://schemas.openxmlformats.org/wordprocessingml/2006/main" xmlns:w14="http://schemas.microsoft.com/office/word/2010/wordml" xmlns:w15="http://schemas.microsoft.com/office/word/2012/wordml" xmlns:w16cex="http://schemas.microsoft.com/office/word/2018/wordml/cex" xmlns:w16cid="http://schemas.microsoft.com/office/word/2016/wordml/cid" xmlns:w16="http://schemas.microsoft.com/office/word/2018/wordml" xmlns:w16sdtdh="http://schemas.microsoft.com/office/word/2020/wordml/sdtdatahash" xmlns:w16se="http://schemas.microsoft.com/office/word/2015/wordml/symex" xmlns:wpg="http://schemas.microsoft.com/office/word/2010/wordprocessingGroup" xmlns:wpi="http://schemas.microsoft.com/office/word/2010/wordprocessingInk" xmlns:wne="http://schemas.microsoft.com/office/word/2006/wordml" xmlns:wps="http://schemas.microsoft.com/office/word/2010/wordprocessingShape" mc:Ignorable="w14 w15 w16se w16cid w16 w16cex w16sdtdh wp14">
+<w:numbering xmlns:wpc="http://schemas.microsoft.com/office/word/2010/wordprocessingCanvas" xmlns:cx="http://schemas.microsoft.com/office/drawing/2014/chartex" xmlns:cx1="http://schemas.microsoft.com/office/drawing/2015/9/8/chartex" xmlns:cx2="http://schemas.microsoft.com/office/drawing/2015/10/21/chartex" xmlns:cx3="http://schemas.microsoft.com/office/drawing/2016/5/9/chartex" xmlns:cx4="http://schemas.microsoft.com/office/drawing/2016/5/10/chartex" xmlns:cx5="http://schemas.microsoft.com/office/drawing/2016/5/11/chartex" xmlns:cx6="http://schemas.microsoft.com/office/drawing/2016/5/12/chartex" xmlns:cx7="http://schemas.microsoft.com/office/drawing/2016/5/13/chartex" xmlns:cx8="http://schemas.microsoft.com/office/drawing/2016/5/14/chartex" xmlns:mc="http://schemas.openxmlformats.org/markup-compatibility/2006" xmlns:m="http://schemas.openxmlformats.org/officeDocument/2006/math" xmlns:aink="http://schemas.microsoft.com/office/drawing/2016/ink" xmlns:am3d="http://schemas.microsoft.com/office/drawing/2017/model3d" xmlns:oel="http://schemas.microsoft.com/office/2019/extlst" xmlns:r="http://schemas.openxmlformats.org/officeDocument/2006/relationships" xmlns:wp14="http://schemas.microsoft.com/office/word/2010/wordprocessingDrawing" xmlns:wp="http://schemas.openxmlformats.org/drawingml/2006/wordprocessingDrawing" xmlns:wpg="http://schemas.microsoft.com/office/word/2010/wordprocessingGroup" xmlns:wpi="http://schemas.microsoft.com/office/word/2010/wordprocessingInk" xmlns:wps="http://schemas.microsoft.com/office/word/2010/wordprocessingShape" xmlns:o="urn:schemas-microsoft-com:office:office" xmlns:v="urn:schemas-microsoft-com:vml" xmlns:w10="urn:schemas-microsoft-com:office:word" xmlns:w="http://schemas.openxmlformats.org/wordprocessingml/2006/main" xmlns:w14="http://schemas.microsoft.com/office/word/2010/wordml" xmlns:w15="http://schemas.microsoft.com/office/word/2012/wordml" xmlns:w16cex="http://schemas.microsoft.com/office/word/2018/wordml/cex" xmlns:w16cid="http://schemas.microsoft.com/office/word/2016/wordml/cid" xmlns:w16="http://schemas.microsoft.com/office/word/2018/wordml" xmlns:w16sdtdh="http://schemas.microsoft.com/office/word/2020/wordml/sdtdatahash" xmlns:w16sdtfl="http://schemas.microsoft.com/office/word/2024/wordml/sdtformatlock" xmlns:w16se="http://schemas.microsoft.com/office/word/2015/wordml/symex" xmlns:w16du="http://schemas.microsoft.com/office/word/2023/wordml/word16du" xmlns:wne="http://schemas.microsoft.com/office/word/2006/wordml" mc:Ignorable="w14 w15 w16se w16cid w16 w16cex w16sdtdh w16sdtfl w16du wp14">
   <w:abstractNum w:abstractNumId="0" w15:restartNumberingAfterBreak="0">
     <w:nsid w:val="27EA03C6"/>
     <w:multiLevelType w:val="hybridMultilevel"/>
@@ -5134,14 +4922,14 @@
 </file>
 
 <file path=word/styles.xml><?xml version="1.0" encoding="utf-8"?>
-<w:styles xmlns:mc="http://schemas.openxmlformats.org/markup-compatibility/2006" xmlns:r="http://schemas.openxmlformats.org/officeDocument/2006/relationships" xmlns:w="http://schemas.openxmlformats.org/wordprocessingml/2006/main" xmlns:w14="http://schemas.microsoft.com/office/word/2010/wordml" xmlns:w15="http://schemas.microsoft.com/office/word/2012/wordml" xmlns:w16cex="http://schemas.microsoft.com/office/word/2018/wordml/cex" xmlns:w16cid="http://schemas.microsoft.com/office/word/2016/wordml/cid" xmlns:w16="http://schemas.microsoft.com/office/word/2018/wordml" xmlns:w16sdtdh="http://schemas.microsoft.com/office/word/2020/wordml/sdtdatahash" xmlns:w16se="http://schemas.microsoft.com/office/word/2015/wordml/symex" mc:Ignorable="w14 w15 w16se w16cid w16 w16cex w16sdtdh">
+<w:styles xmlns:mc="http://schemas.openxmlformats.org/markup-compatibility/2006" xmlns:r="http://schemas.openxmlformats.org/officeDocument/2006/relationships" xmlns:w="http://schemas.openxmlformats.org/wordprocessingml/2006/main" xmlns:w14="http://schemas.microsoft.com/office/word/2010/wordml" xmlns:w15="http://schemas.microsoft.com/office/word/2012/wordml" xmlns:w16cex="http://schemas.microsoft.com/office/word/2018/wordml/cex" xmlns:w16cid="http://schemas.microsoft.com/office/word/2016/wordml/cid" xmlns:w16="http://schemas.microsoft.com/office/word/2018/wordml" xmlns:w16sdtdh="http://schemas.microsoft.com/office/word/2020/wordml/sdtdatahash" xmlns:w16sdtfl="http://schemas.microsoft.com/office/word/2024/wordml/sdtformatlock" xmlns:w16se="http://schemas.microsoft.com/office/word/2015/wordml/symex" xmlns:w16du="http://schemas.microsoft.com/office/word/2023/wordml/word16du" mc:Ignorable="w14 w15 w16se w16cid w16 w16cex w16sdtdh w16sdtfl w16du">
   <w:docDefaults>
     <w:rPrDefault>
       <w:rPr>
         <w:rFonts w:ascii="Calibri" w:eastAsia="Calibri" w:hAnsi="Calibri" w:cs="Calibri"/>
         <w:sz w:val="22"/>
         <w:szCs w:val="22"/>
-        <w:lang w:val="en-TR" w:eastAsia="en-US" w:bidi="ar-SA"/>
+        <w:lang w:val="en-LV" w:eastAsia="en-US" w:bidi="ar-SA"/>
       </w:rPr>
     </w:rPrDefault>
     <w:pPrDefault/>

</xml_diff>